<commit_message>
correct the gathered data
</commit_message>
<xml_diff>
--- a/docs/week_3/GatheredData - Domain Analysis.docx
+++ b/docs/week_3/GatheredData - Domain Analysis.docx
@@ -21,8 +21,6 @@
         </w:rPr>
         <w:t>Domain Analysis</w:t>
       </w:r>
-      <w:bookmarkStart w:id="0" w:name="_GoBack"/>
-      <w:bookmarkEnd w:id="0"/>
     </w:p>
     <w:p>
       <w:pPr>
@@ -452,7 +450,85 @@
           <w:szCs w:val="28"/>
           <w:lang w:val="en-US"/>
         </w:rPr>
-        <w:t>Other effective tools for teaching programming are Kodable, CodeMonkey, BlocklyGames. Their main effectiveness in developing computational thinking comes from their gamified design, which engages children by providing immediate feedback and having a memorable interface [</w:t>
+        <w:t xml:space="preserve">Other effective tools for teaching programming are </w:t>
+      </w:r>
+      <w:proofErr w:type="spellStart"/>
+      <w:r>
+        <w:rPr>
+          <w:rStyle w:val="normaltextrun"/>
+          <w:rFonts w:ascii="Times New Roman" w:eastAsiaTheme="majorEastAsia" w:hAnsi="Times New Roman" w:cs="Times New Roman"/>
+          <w:bCs/>
+          <w:iCs/>
+          <w:sz w:val="28"/>
+          <w:szCs w:val="28"/>
+          <w:lang w:val="en-US"/>
+        </w:rPr>
+        <w:t>Kodable</w:t>
+      </w:r>
+      <w:proofErr w:type="spellEnd"/>
+      <w:r>
+        <w:rPr>
+          <w:rStyle w:val="normaltextrun"/>
+          <w:rFonts w:ascii="Times New Roman" w:eastAsiaTheme="majorEastAsia" w:hAnsi="Times New Roman" w:cs="Times New Roman"/>
+          <w:bCs/>
+          <w:iCs/>
+          <w:sz w:val="28"/>
+          <w:szCs w:val="28"/>
+          <w:lang w:val="en-US"/>
+        </w:rPr>
+        <w:t xml:space="preserve">, </w:t>
+      </w:r>
+      <w:proofErr w:type="spellStart"/>
+      <w:r>
+        <w:rPr>
+          <w:rStyle w:val="normaltextrun"/>
+          <w:rFonts w:ascii="Times New Roman" w:eastAsiaTheme="majorEastAsia" w:hAnsi="Times New Roman" w:cs="Times New Roman"/>
+          <w:bCs/>
+          <w:iCs/>
+          <w:sz w:val="28"/>
+          <w:szCs w:val="28"/>
+          <w:lang w:val="en-US"/>
+        </w:rPr>
+        <w:t>CodeMonkey</w:t>
+      </w:r>
+      <w:proofErr w:type="spellEnd"/>
+      <w:r>
+        <w:rPr>
+          <w:rStyle w:val="normaltextrun"/>
+          <w:rFonts w:ascii="Times New Roman" w:eastAsiaTheme="majorEastAsia" w:hAnsi="Times New Roman" w:cs="Times New Roman"/>
+          <w:bCs/>
+          <w:iCs/>
+          <w:sz w:val="28"/>
+          <w:szCs w:val="28"/>
+          <w:lang w:val="en-US"/>
+        </w:rPr>
+        <w:t xml:space="preserve">, </w:t>
+      </w:r>
+      <w:proofErr w:type="spellStart"/>
+      <w:r>
+        <w:rPr>
+          <w:rStyle w:val="normaltextrun"/>
+          <w:rFonts w:ascii="Times New Roman" w:eastAsiaTheme="majorEastAsia" w:hAnsi="Times New Roman" w:cs="Times New Roman"/>
+          <w:bCs/>
+          <w:iCs/>
+          <w:sz w:val="28"/>
+          <w:szCs w:val="28"/>
+          <w:lang w:val="en-US"/>
+        </w:rPr>
+        <w:t>BlocklyGames</w:t>
+      </w:r>
+      <w:proofErr w:type="spellEnd"/>
+      <w:r>
+        <w:rPr>
+          <w:rStyle w:val="normaltextrun"/>
+          <w:rFonts w:ascii="Times New Roman" w:eastAsiaTheme="majorEastAsia" w:hAnsi="Times New Roman" w:cs="Times New Roman"/>
+          <w:bCs/>
+          <w:iCs/>
+          <w:sz w:val="28"/>
+          <w:szCs w:val="28"/>
+          <w:lang w:val="en-US"/>
+        </w:rPr>
+        <w:t>. Their main effectiveness in developing computational thinking comes from their gamified design, which engages children by providing immediate feedback and having a memorable interface [</w:t>
       </w:r>
       <w:r>
         <w:rPr>
@@ -1020,7 +1096,49 @@
           <w:szCs w:val="28"/>
           <w:lang w:val="en-US"/>
         </w:rPr>
-        <w:t>processes, coaches learners, and elicits articulation, with support gradually fading as competence increases [17]. Many educational software interfaces exemplify software-realized scaffolding through feedback, prompts, and structured guidance [18].</w:t>
+        <w:t>processes, </w:t>
+      </w:r>
+      <w:proofErr w:type="gramStart"/>
+      <w:r>
+        <w:rPr>
+          <w:rStyle w:val="normaltextrun"/>
+          <w:rFonts w:eastAsiaTheme="majorEastAsia"/>
+          <w:sz w:val="28"/>
+          <w:szCs w:val="28"/>
+          <w:lang w:val="en-US"/>
+        </w:rPr>
+        <w:t>coaches</w:t>
+      </w:r>
+      <w:proofErr w:type="gramEnd"/>
+      <w:r>
+        <w:rPr>
+          <w:rStyle w:val="normaltextrun"/>
+          <w:rFonts w:eastAsiaTheme="majorEastAsia"/>
+          <w:sz w:val="28"/>
+          <w:szCs w:val="28"/>
+          <w:lang w:val="en-US"/>
+        </w:rPr>
+        <w:t> learners, and elicits articulation, with support gradually fa</w:t>
+      </w:r>
+      <w:r>
+        <w:rPr>
+          <w:rStyle w:val="normaltextrun"/>
+          <w:rFonts w:eastAsiaTheme="majorEastAsia"/>
+          <w:sz w:val="28"/>
+          <w:szCs w:val="28"/>
+          <w:lang w:val="en-US"/>
+        </w:rPr>
+        <w:t>ding as competence increases [18</w:t>
+      </w:r>
+      <w:r>
+        <w:rPr>
+          <w:rStyle w:val="normaltextrun"/>
+          <w:rFonts w:eastAsiaTheme="majorEastAsia"/>
+          <w:sz w:val="28"/>
+          <w:szCs w:val="28"/>
+          <w:lang w:val="en-US"/>
+        </w:rPr>
+        <w:t>]. Many educational software interfaces exemplify software-realized scaffolding through feedback, prompts, and structured guidance [18].</w:t>
       </w:r>
       <w:r>
         <w:rPr>
@@ -1429,6 +1547,7 @@
         </w:rPr>
         <w:t>[2]</w:t>
       </w:r>
+      <w:proofErr w:type="spellStart"/>
       <w:r>
         <w:rPr>
           <w:rStyle w:val="eop"/>
@@ -1439,7 +1558,20 @@
           <w:szCs w:val="28"/>
           <w:lang w:val="en-US"/>
         </w:rPr>
-        <w:t>Popat, S., &amp; Starkey, L. (2019). Learning to code or coding to learn? A systematic re‑view. Computers &amp; Education, 128: 365–376. Available at: https://doi.org/10.1016/j.compedu.2018.10.005</w:t>
+        <w:t>Popat</w:t>
+      </w:r>
+      <w:proofErr w:type="spellEnd"/>
+      <w:r>
+        <w:rPr>
+          <w:rStyle w:val="eop"/>
+          <w:rFonts w:cs="Times New Roman"/>
+          <w:b w:val="0"/>
+          <w:color w:val="111111"/>
+          <w:sz w:val="28"/>
+          <w:szCs w:val="28"/>
+          <w:lang w:val="en-US"/>
+        </w:rPr>
+        <w:t>, S., &amp; Starkey, L. (2019). Learning to code or coding to learn? A systematic re‑view. Computers &amp; Education, 128: 365–376. Available at: https://doi.org/10.1016/j.compedu.2018.10.005</w:t>
       </w:r>
     </w:p>
     <w:p>
@@ -1498,6 +1630,7 @@
         </w:rPr>
         <w:t xml:space="preserve"> </w:t>
       </w:r>
+      <w:proofErr w:type="spellStart"/>
       <w:r>
         <w:rPr>
           <w:rFonts w:cs="Times New Roman"/>
@@ -1506,7 +1639,128 @@
           <w:szCs w:val="28"/>
           <w:lang w:val="en-US"/>
         </w:rPr>
-        <w:t>Solorzano, Rolando &amp; Matos, Leonor &amp; Palomino, David &amp; Hulsa, Miguel &amp; Huaricachi, Jeanny &amp; Saico, Delio. (2025). Analysis of the Scratch program for computational thinking in schoolchildren in an educational institution in Peru: a network analysis. Journal of Educational Technology Development and Exchange. 18. 118-132. 10.18785/jetde.1803.06.</w:t>
+        <w:t>Solorzano</w:t>
+      </w:r>
+      <w:proofErr w:type="spellEnd"/>
+      <w:r>
+        <w:rPr>
+          <w:rFonts w:cs="Times New Roman"/>
+          <w:b w:val="0"/>
+          <w:sz w:val="28"/>
+          <w:szCs w:val="28"/>
+          <w:lang w:val="en-US"/>
+        </w:rPr>
+        <w:t xml:space="preserve">, Rolando &amp; Matos, Leonor &amp; Palomino, David &amp; </w:t>
+      </w:r>
+      <w:proofErr w:type="spellStart"/>
+      <w:r>
+        <w:rPr>
+          <w:rFonts w:cs="Times New Roman"/>
+          <w:b w:val="0"/>
+          <w:sz w:val="28"/>
+          <w:szCs w:val="28"/>
+          <w:lang w:val="en-US"/>
+        </w:rPr>
+        <w:t>Hulsa</w:t>
+      </w:r>
+      <w:proofErr w:type="spellEnd"/>
+      <w:r>
+        <w:rPr>
+          <w:rFonts w:cs="Times New Roman"/>
+          <w:b w:val="0"/>
+          <w:sz w:val="28"/>
+          <w:szCs w:val="28"/>
+          <w:lang w:val="en-US"/>
+        </w:rPr>
+        <w:t xml:space="preserve">, Miguel &amp; </w:t>
+      </w:r>
+      <w:proofErr w:type="spellStart"/>
+      <w:r>
+        <w:rPr>
+          <w:rFonts w:cs="Times New Roman"/>
+          <w:b w:val="0"/>
+          <w:sz w:val="28"/>
+          <w:szCs w:val="28"/>
+          <w:lang w:val="en-US"/>
+        </w:rPr>
+        <w:t>Huaricachi</w:t>
+      </w:r>
+      <w:proofErr w:type="spellEnd"/>
+      <w:r>
+        <w:rPr>
+          <w:rFonts w:cs="Times New Roman"/>
+          <w:b w:val="0"/>
+          <w:sz w:val="28"/>
+          <w:szCs w:val="28"/>
+          <w:lang w:val="en-US"/>
+        </w:rPr>
+        <w:t xml:space="preserve">, </w:t>
+      </w:r>
+      <w:proofErr w:type="spellStart"/>
+      <w:r>
+        <w:rPr>
+          <w:rFonts w:cs="Times New Roman"/>
+          <w:b w:val="0"/>
+          <w:sz w:val="28"/>
+          <w:szCs w:val="28"/>
+          <w:lang w:val="en-US"/>
+        </w:rPr>
+        <w:t>Jeanny</w:t>
+      </w:r>
+      <w:proofErr w:type="spellEnd"/>
+      <w:r>
+        <w:rPr>
+          <w:rFonts w:cs="Times New Roman"/>
+          <w:b w:val="0"/>
+          <w:sz w:val="28"/>
+          <w:szCs w:val="28"/>
+          <w:lang w:val="en-US"/>
+        </w:rPr>
+        <w:t xml:space="preserve"> &amp; </w:t>
+      </w:r>
+      <w:proofErr w:type="spellStart"/>
+      <w:r>
+        <w:rPr>
+          <w:rFonts w:cs="Times New Roman"/>
+          <w:b w:val="0"/>
+          <w:sz w:val="28"/>
+          <w:szCs w:val="28"/>
+          <w:lang w:val="en-US"/>
+        </w:rPr>
+        <w:t>Saico</w:t>
+      </w:r>
+      <w:proofErr w:type="spellEnd"/>
+      <w:r>
+        <w:rPr>
+          <w:rFonts w:cs="Times New Roman"/>
+          <w:b w:val="0"/>
+          <w:sz w:val="28"/>
+          <w:szCs w:val="28"/>
+          <w:lang w:val="en-US"/>
+        </w:rPr>
+        <w:t xml:space="preserve">, </w:t>
+      </w:r>
+      <w:proofErr w:type="spellStart"/>
+      <w:r>
+        <w:rPr>
+          <w:rFonts w:cs="Times New Roman"/>
+          <w:b w:val="0"/>
+          <w:sz w:val="28"/>
+          <w:szCs w:val="28"/>
+          <w:lang w:val="en-US"/>
+        </w:rPr>
+        <w:t>Delio</w:t>
+      </w:r>
+      <w:proofErr w:type="spellEnd"/>
+      <w:r>
+        <w:rPr>
+          <w:rFonts w:cs="Times New Roman"/>
+          <w:b w:val="0"/>
+          <w:sz w:val="28"/>
+          <w:szCs w:val="28"/>
+          <w:lang w:val="en-US"/>
+        </w:rPr>
+        <w:t>. (2025). Analysis of the Scratch program for computational thinking in schoolchildren in an educational institution in Peru: a network analysis. Journal of Educational Technology Development and Exchange. 18. 118-132. 10.18785/jetde.1803.06.</w:t>
       </w:r>
     </w:p>
     <w:p>
@@ -1569,6 +1823,7 @@
         </w:rPr>
         <w:t xml:space="preserve"> </w:t>
       </w:r>
+      <w:proofErr w:type="spellStart"/>
       <w:r>
         <w:rPr>
           <w:rStyle w:val="eop"/>
@@ -1578,7 +1833,115 @@
           <w:szCs w:val="28"/>
           <w:lang w:val="en-US"/>
         </w:rPr>
-        <w:t>Kuz, Antonieta. (2023). Computational thinking: an analysis through structured programming using Scratch. Revista de Ciencia y Tecnología. 39. 82-90. 10.36995/j.recyt.2023.39.010.</w:t>
+        <w:t>Kuz</w:t>
+      </w:r>
+      <w:proofErr w:type="spellEnd"/>
+      <w:r>
+        <w:rPr>
+          <w:rStyle w:val="eop"/>
+          <w:rFonts w:cs="Times New Roman"/>
+          <w:b w:val="0"/>
+          <w:sz w:val="28"/>
+          <w:szCs w:val="28"/>
+          <w:lang w:val="en-US"/>
+        </w:rPr>
+        <w:t xml:space="preserve">, </w:t>
+      </w:r>
+      <w:proofErr w:type="spellStart"/>
+      <w:r>
+        <w:rPr>
+          <w:rStyle w:val="eop"/>
+          <w:rFonts w:cs="Times New Roman"/>
+          <w:b w:val="0"/>
+          <w:sz w:val="28"/>
+          <w:szCs w:val="28"/>
+          <w:lang w:val="en-US"/>
+        </w:rPr>
+        <w:t>Antonieta</w:t>
+      </w:r>
+      <w:proofErr w:type="spellEnd"/>
+      <w:r>
+        <w:rPr>
+          <w:rStyle w:val="eop"/>
+          <w:rFonts w:cs="Times New Roman"/>
+          <w:b w:val="0"/>
+          <w:sz w:val="28"/>
+          <w:szCs w:val="28"/>
+          <w:lang w:val="en-US"/>
+        </w:rPr>
+        <w:t xml:space="preserve">. (2023). Computational thinking: an analysis through structured programming using Scratch. </w:t>
+      </w:r>
+      <w:proofErr w:type="spellStart"/>
+      <w:r>
+        <w:rPr>
+          <w:rStyle w:val="eop"/>
+          <w:rFonts w:cs="Times New Roman"/>
+          <w:b w:val="0"/>
+          <w:sz w:val="28"/>
+          <w:szCs w:val="28"/>
+          <w:lang w:val="en-US"/>
+        </w:rPr>
+        <w:t>Revista</w:t>
+      </w:r>
+      <w:proofErr w:type="spellEnd"/>
+      <w:r>
+        <w:rPr>
+          <w:rStyle w:val="eop"/>
+          <w:rFonts w:cs="Times New Roman"/>
+          <w:b w:val="0"/>
+          <w:sz w:val="28"/>
+          <w:szCs w:val="28"/>
+          <w:lang w:val="en-US"/>
+        </w:rPr>
+        <w:t xml:space="preserve"> de </w:t>
+      </w:r>
+      <w:proofErr w:type="spellStart"/>
+      <w:r>
+        <w:rPr>
+          <w:rStyle w:val="eop"/>
+          <w:rFonts w:cs="Times New Roman"/>
+          <w:b w:val="0"/>
+          <w:sz w:val="28"/>
+          <w:szCs w:val="28"/>
+          <w:lang w:val="en-US"/>
+        </w:rPr>
+        <w:t>Ciencia</w:t>
+      </w:r>
+      <w:proofErr w:type="spellEnd"/>
+      <w:r>
+        <w:rPr>
+          <w:rStyle w:val="eop"/>
+          <w:rFonts w:cs="Times New Roman"/>
+          <w:b w:val="0"/>
+          <w:sz w:val="28"/>
+          <w:szCs w:val="28"/>
+          <w:lang w:val="en-US"/>
+        </w:rPr>
+        <w:t xml:space="preserve"> y </w:t>
+      </w:r>
+      <w:proofErr w:type="spellStart"/>
+      <w:r>
+        <w:rPr>
+          <w:rStyle w:val="eop"/>
+          <w:rFonts w:cs="Times New Roman"/>
+          <w:b w:val="0"/>
+          <w:sz w:val="28"/>
+          <w:szCs w:val="28"/>
+          <w:lang w:val="en-US"/>
+        </w:rPr>
+        <w:t>Tecnología</w:t>
+      </w:r>
+      <w:proofErr w:type="spellEnd"/>
+      <w:r>
+        <w:rPr>
+          <w:rStyle w:val="eop"/>
+          <w:rFonts w:cs="Times New Roman"/>
+          <w:b w:val="0"/>
+          <w:sz w:val="28"/>
+          <w:szCs w:val="28"/>
+          <w:lang w:val="en-US"/>
+        </w:rPr>
+        <w:t>. 39. 82-90. 10.36995/j.recyt.2023.39.010.</w:t>
       </w:r>
     </w:p>
     <w:p>
@@ -1636,6 +1999,7 @@
         </w:rPr>
         <w:t xml:space="preserve"> </w:t>
       </w:r>
+      <w:proofErr w:type="spellStart"/>
       <w:r>
         <w:rPr>
           <w:rStyle w:val="eop"/>
@@ -1645,7 +2009,91 @@
           <w:szCs w:val="28"/>
           <w:lang w:val="en-US"/>
         </w:rPr>
-        <w:t>Hlazova, V. V., Monoharova, V. A., &amp; Kasianova, T.  M.  (2024).  Integration  of  game elements  and  digital  tools  into  modern methods  of  programming  teaching.</w:t>
+        <w:t>Hlazova</w:t>
+      </w:r>
+      <w:proofErr w:type="spellEnd"/>
+      <w:r>
+        <w:rPr>
+          <w:rStyle w:val="eop"/>
+          <w:rFonts w:cs="Times New Roman"/>
+          <w:b w:val="0"/>
+          <w:sz w:val="28"/>
+          <w:szCs w:val="28"/>
+          <w:lang w:val="en-US"/>
+        </w:rPr>
+        <w:t xml:space="preserve">, V. V., </w:t>
+      </w:r>
+      <w:proofErr w:type="spellStart"/>
+      <w:r>
+        <w:rPr>
+          <w:rStyle w:val="eop"/>
+          <w:rFonts w:cs="Times New Roman"/>
+          <w:b w:val="0"/>
+          <w:sz w:val="28"/>
+          <w:szCs w:val="28"/>
+          <w:lang w:val="en-US"/>
+        </w:rPr>
+        <w:t>Monoharova</w:t>
+      </w:r>
+      <w:proofErr w:type="spellEnd"/>
+      <w:r>
+        <w:rPr>
+          <w:rStyle w:val="eop"/>
+          <w:rFonts w:cs="Times New Roman"/>
+          <w:b w:val="0"/>
+          <w:sz w:val="28"/>
+          <w:szCs w:val="28"/>
+          <w:lang w:val="en-US"/>
+        </w:rPr>
+        <w:t xml:space="preserve">, V. A., &amp; </w:t>
+      </w:r>
+      <w:proofErr w:type="spellStart"/>
+      <w:r>
+        <w:rPr>
+          <w:rStyle w:val="eop"/>
+          <w:rFonts w:cs="Times New Roman"/>
+          <w:b w:val="0"/>
+          <w:sz w:val="28"/>
+          <w:szCs w:val="28"/>
+          <w:lang w:val="en-US"/>
+        </w:rPr>
+        <w:t>Kasianova</w:t>
+      </w:r>
+      <w:proofErr w:type="spellEnd"/>
+      <w:r>
+        <w:rPr>
+          <w:rStyle w:val="eop"/>
+          <w:rFonts w:cs="Times New Roman"/>
+          <w:b w:val="0"/>
+          <w:sz w:val="28"/>
+          <w:szCs w:val="28"/>
+          <w:lang w:val="en-US"/>
+        </w:rPr>
+        <w:t xml:space="preserve">, T.  M.  (2024).  </w:t>
+      </w:r>
+      <w:proofErr w:type="gramStart"/>
+      <w:r>
+        <w:rPr>
+          <w:rStyle w:val="eop"/>
+          <w:rFonts w:cs="Times New Roman"/>
+          <w:b w:val="0"/>
+          <w:sz w:val="28"/>
+          <w:szCs w:val="28"/>
+          <w:lang w:val="en-US"/>
+        </w:rPr>
+        <w:t>Integration  of</w:t>
+      </w:r>
+      <w:proofErr w:type="gramEnd"/>
+      <w:r>
+        <w:rPr>
+          <w:rStyle w:val="eop"/>
+          <w:rFonts w:cs="Times New Roman"/>
+          <w:b w:val="0"/>
+          <w:sz w:val="28"/>
+          <w:szCs w:val="28"/>
+          <w:lang w:val="en-US"/>
+        </w:rPr>
+        <w:t xml:space="preserve">  game elements  and  digital  tools  into  modern methods  of  programming  teaching.</w:t>
       </w:r>
     </w:p>
     <w:p>
@@ -1678,8 +2126,200 @@
           <w:sz w:val="28"/>
           <w:szCs w:val="28"/>
         </w:rPr>
-        <w:t>] Медведєва, М. О., Жмурко, О. І., Криворучко, І. І., &amp; Ковтанюк, М. С. (2021). Використання  ігрових  онлайн-сервісів  у  процесі  вивчення  мов  програмування. Актуальн</w:t>
-      </w:r>
+        <w:t xml:space="preserve">] </w:t>
+      </w:r>
+      <w:proofErr w:type="spellStart"/>
+      <w:r>
+        <w:rPr>
+          <w:rFonts w:ascii="Times New Roman" w:hAnsi="Times New Roman" w:cs="Times New Roman"/>
+          <w:sz w:val="28"/>
+          <w:szCs w:val="28"/>
+        </w:rPr>
+        <w:t>Медведєва</w:t>
+      </w:r>
+      <w:proofErr w:type="spellEnd"/>
+      <w:r>
+        <w:rPr>
+          <w:rFonts w:ascii="Times New Roman" w:hAnsi="Times New Roman" w:cs="Times New Roman"/>
+          <w:sz w:val="28"/>
+          <w:szCs w:val="28"/>
+        </w:rPr>
+        <w:t xml:space="preserve">, М. О., </w:t>
+      </w:r>
+      <w:proofErr w:type="spellStart"/>
+      <w:r>
+        <w:rPr>
+          <w:rFonts w:ascii="Times New Roman" w:hAnsi="Times New Roman" w:cs="Times New Roman"/>
+          <w:sz w:val="28"/>
+          <w:szCs w:val="28"/>
+        </w:rPr>
+        <w:t>Жмурко</w:t>
+      </w:r>
+      <w:proofErr w:type="spellEnd"/>
+      <w:r>
+        <w:rPr>
+          <w:rFonts w:ascii="Times New Roman" w:hAnsi="Times New Roman" w:cs="Times New Roman"/>
+          <w:sz w:val="28"/>
+          <w:szCs w:val="28"/>
+        </w:rPr>
+        <w:t xml:space="preserve">, О. І., Криворучко, І. І., &amp; </w:t>
+      </w:r>
+      <w:proofErr w:type="spellStart"/>
+      <w:r>
+        <w:rPr>
+          <w:rFonts w:ascii="Times New Roman" w:hAnsi="Times New Roman" w:cs="Times New Roman"/>
+          <w:sz w:val="28"/>
+          <w:szCs w:val="28"/>
+        </w:rPr>
+        <w:t>Ковтанюк</w:t>
+      </w:r>
+      <w:proofErr w:type="spellEnd"/>
+      <w:r>
+        <w:rPr>
+          <w:rFonts w:ascii="Times New Roman" w:hAnsi="Times New Roman" w:cs="Times New Roman"/>
+          <w:sz w:val="28"/>
+          <w:szCs w:val="28"/>
+        </w:rPr>
+        <w:t xml:space="preserve">, М. С. (2021). </w:t>
+      </w:r>
+      <w:proofErr w:type="spellStart"/>
+      <w:proofErr w:type="gramStart"/>
+      <w:r>
+        <w:rPr>
+          <w:rFonts w:ascii="Times New Roman" w:hAnsi="Times New Roman" w:cs="Times New Roman"/>
+          <w:sz w:val="28"/>
+          <w:szCs w:val="28"/>
+        </w:rPr>
+        <w:t>Використання</w:t>
+      </w:r>
+      <w:proofErr w:type="spellEnd"/>
+      <w:r>
+        <w:rPr>
+          <w:rFonts w:ascii="Times New Roman" w:hAnsi="Times New Roman" w:cs="Times New Roman"/>
+          <w:sz w:val="28"/>
+          <w:szCs w:val="28"/>
+        </w:rPr>
+        <w:t xml:space="preserve">  </w:t>
+      </w:r>
+      <w:proofErr w:type="spellStart"/>
+      <w:r>
+        <w:rPr>
+          <w:rFonts w:ascii="Times New Roman" w:hAnsi="Times New Roman" w:cs="Times New Roman"/>
+          <w:sz w:val="28"/>
+          <w:szCs w:val="28"/>
+        </w:rPr>
+        <w:t>ігрових</w:t>
+      </w:r>
+      <w:proofErr w:type="spellEnd"/>
+      <w:proofErr w:type="gramEnd"/>
+      <w:r>
+        <w:rPr>
+          <w:rFonts w:ascii="Times New Roman" w:hAnsi="Times New Roman" w:cs="Times New Roman"/>
+          <w:sz w:val="28"/>
+          <w:szCs w:val="28"/>
+        </w:rPr>
+        <w:t xml:space="preserve">  онлайн-</w:t>
+      </w:r>
+      <w:proofErr w:type="spellStart"/>
+      <w:r>
+        <w:rPr>
+          <w:rFonts w:ascii="Times New Roman" w:hAnsi="Times New Roman" w:cs="Times New Roman"/>
+          <w:sz w:val="28"/>
+          <w:szCs w:val="28"/>
+        </w:rPr>
+        <w:t>сервісів</w:t>
+      </w:r>
+      <w:proofErr w:type="spellEnd"/>
+      <w:r>
+        <w:rPr>
+          <w:rFonts w:ascii="Times New Roman" w:hAnsi="Times New Roman" w:cs="Times New Roman"/>
+          <w:sz w:val="28"/>
+          <w:szCs w:val="28"/>
+        </w:rPr>
+        <w:t xml:space="preserve">  у  </w:t>
+      </w:r>
+      <w:proofErr w:type="spellStart"/>
+      <w:r>
+        <w:rPr>
+          <w:rFonts w:ascii="Times New Roman" w:hAnsi="Times New Roman" w:cs="Times New Roman"/>
+          <w:sz w:val="28"/>
+          <w:szCs w:val="28"/>
+        </w:rPr>
+        <w:t>процесі</w:t>
+      </w:r>
+      <w:proofErr w:type="spellEnd"/>
+      <w:r>
+        <w:rPr>
+          <w:rFonts w:ascii="Times New Roman" w:hAnsi="Times New Roman" w:cs="Times New Roman"/>
+          <w:sz w:val="28"/>
+          <w:szCs w:val="28"/>
+        </w:rPr>
+        <w:t xml:space="preserve">  </w:t>
+      </w:r>
+      <w:proofErr w:type="spellStart"/>
+      <w:r>
+        <w:rPr>
+          <w:rFonts w:ascii="Times New Roman" w:hAnsi="Times New Roman" w:cs="Times New Roman"/>
+          <w:sz w:val="28"/>
+          <w:szCs w:val="28"/>
+        </w:rPr>
+        <w:t>вивчення</w:t>
+      </w:r>
+      <w:proofErr w:type="spellEnd"/>
+      <w:r>
+        <w:rPr>
+          <w:rFonts w:ascii="Times New Roman" w:hAnsi="Times New Roman" w:cs="Times New Roman"/>
+          <w:sz w:val="28"/>
+          <w:szCs w:val="28"/>
+        </w:rPr>
+        <w:t xml:space="preserve">  </w:t>
+      </w:r>
+      <w:proofErr w:type="spellStart"/>
+      <w:r>
+        <w:rPr>
+          <w:rFonts w:ascii="Times New Roman" w:hAnsi="Times New Roman" w:cs="Times New Roman"/>
+          <w:sz w:val="28"/>
+          <w:szCs w:val="28"/>
+        </w:rPr>
+        <w:t>мов</w:t>
+      </w:r>
+      <w:proofErr w:type="spellEnd"/>
+      <w:r>
+        <w:rPr>
+          <w:rFonts w:ascii="Times New Roman" w:hAnsi="Times New Roman" w:cs="Times New Roman"/>
+          <w:sz w:val="28"/>
+          <w:szCs w:val="28"/>
+        </w:rPr>
+        <w:t xml:space="preserve">  </w:t>
+      </w:r>
+      <w:proofErr w:type="spellStart"/>
+      <w:r>
+        <w:rPr>
+          <w:rFonts w:ascii="Times New Roman" w:hAnsi="Times New Roman" w:cs="Times New Roman"/>
+          <w:sz w:val="28"/>
+          <w:szCs w:val="28"/>
+        </w:rPr>
+        <w:t>програмування</w:t>
+      </w:r>
+      <w:proofErr w:type="spellEnd"/>
+      <w:r>
+        <w:rPr>
+          <w:rFonts w:ascii="Times New Roman" w:hAnsi="Times New Roman" w:cs="Times New Roman"/>
+          <w:sz w:val="28"/>
+          <w:szCs w:val="28"/>
+        </w:rPr>
+        <w:t xml:space="preserve">. </w:t>
+      </w:r>
+      <w:proofErr w:type="spellStart"/>
+      <w:r>
+        <w:rPr>
+          <w:rFonts w:ascii="Times New Roman" w:hAnsi="Times New Roman" w:cs="Times New Roman"/>
+          <w:sz w:val="28"/>
+          <w:szCs w:val="28"/>
+        </w:rPr>
+        <w:t>Актуальн</w:t>
+      </w:r>
+      <w:proofErr w:type="gramStart"/>
       <w:r>
         <w:rPr>
           <w:rFonts w:ascii="Times New Roman" w:hAnsi="Times New Roman" w:cs="Times New Roman"/>
@@ -1689,13 +2329,42 @@
         </w:rPr>
         <w:t>i</w:t>
       </w:r>
-      <w:r>
-        <w:rPr>
-          <w:rFonts w:ascii="Times New Roman" w:hAnsi="Times New Roman" w:cs="Times New Roman"/>
-          <w:sz w:val="28"/>
-          <w:szCs w:val="28"/>
-        </w:rPr>
-        <w:t xml:space="preserve">  питання  гуман</w:t>
+      <w:proofErr w:type="spellEnd"/>
+      <w:r>
+        <w:rPr>
+          <w:rFonts w:ascii="Times New Roman" w:hAnsi="Times New Roman" w:cs="Times New Roman"/>
+          <w:sz w:val="28"/>
+          <w:szCs w:val="28"/>
+        </w:rPr>
+        <w:t xml:space="preserve">  </w:t>
+      </w:r>
+      <w:proofErr w:type="spellStart"/>
+      <w:r>
+        <w:rPr>
+          <w:rFonts w:ascii="Times New Roman" w:hAnsi="Times New Roman" w:cs="Times New Roman"/>
+          <w:sz w:val="28"/>
+          <w:szCs w:val="28"/>
+        </w:rPr>
+        <w:t>питання</w:t>
+      </w:r>
+      <w:proofErr w:type="spellEnd"/>
+      <w:proofErr w:type="gramEnd"/>
+      <w:r>
+        <w:rPr>
+          <w:rFonts w:ascii="Times New Roman" w:hAnsi="Times New Roman" w:cs="Times New Roman"/>
+          <w:sz w:val="28"/>
+          <w:szCs w:val="28"/>
+        </w:rPr>
+        <w:t xml:space="preserve">  </w:t>
+      </w:r>
+      <w:proofErr w:type="spellStart"/>
+      <w:r>
+        <w:rPr>
+          <w:rFonts w:ascii="Times New Roman" w:hAnsi="Times New Roman" w:cs="Times New Roman"/>
+          <w:sz w:val="28"/>
+          <w:szCs w:val="28"/>
+        </w:rPr>
+        <w:t>гуман</w:t>
       </w:r>
       <w:r>
         <w:rPr>
@@ -1712,7 +2381,16 @@
           <w:sz w:val="28"/>
           <w:szCs w:val="28"/>
         </w:rPr>
-        <w:t xml:space="preserve">тарних  наук,  36(2),  248–255. </w:t>
+        <w:t>тарних</w:t>
+      </w:r>
+      <w:proofErr w:type="spellEnd"/>
+      <w:r>
+        <w:rPr>
+          <w:rFonts w:ascii="Times New Roman" w:hAnsi="Times New Roman" w:cs="Times New Roman"/>
+          <w:sz w:val="28"/>
+          <w:szCs w:val="28"/>
+        </w:rPr>
+        <w:t xml:space="preserve">  наук,  36(2),  248–255. </w:t>
       </w:r>
       <w:hyperlink r:id="rId6" w:history="1">
         <w:r>
@@ -1734,6 +2412,7 @@
           </w:rPr>
           <w:t>://</w:t>
         </w:r>
+        <w:proofErr w:type="spellStart"/>
         <w:r>
           <w:rPr>
             <w:rStyle w:val="a4"/>
@@ -1744,6 +2423,7 @@
           </w:rPr>
           <w:t>doi</w:t>
         </w:r>
+        <w:proofErr w:type="spellEnd"/>
         <w:r>
           <w:rPr>
             <w:rStyle w:val="a4"/>
@@ -1815,7 +2495,215 @@
           <w:sz w:val="28"/>
           <w:szCs w:val="28"/>
         </w:rPr>
-        <w:t>Мошкова, Н., Алєксєєва, Г. М., Горбатюк, Л. В., Кравченко, Н. В., &amp; Кортез, Х. І.  (2024).  Гейміфікація  як  один  із  трендів  сучасної  освіти.  Молодь  і  ринок  : науково-педагогічний журнал, 4 (224), 82–87.</w:t>
+        <w:t xml:space="preserve">Мошкова, Н., </w:t>
+      </w:r>
+      <w:proofErr w:type="spellStart"/>
+      <w:r>
+        <w:rPr>
+          <w:rFonts w:ascii="Times New Roman" w:hAnsi="Times New Roman" w:cs="Times New Roman"/>
+          <w:sz w:val="28"/>
+          <w:szCs w:val="28"/>
+        </w:rPr>
+        <w:t>Алєксєєва</w:t>
+      </w:r>
+      <w:proofErr w:type="spellEnd"/>
+      <w:r>
+        <w:rPr>
+          <w:rFonts w:ascii="Times New Roman" w:hAnsi="Times New Roman" w:cs="Times New Roman"/>
+          <w:sz w:val="28"/>
+          <w:szCs w:val="28"/>
+        </w:rPr>
+        <w:t xml:space="preserve">, Г. М., </w:t>
+      </w:r>
+      <w:proofErr w:type="spellStart"/>
+      <w:r>
+        <w:rPr>
+          <w:rFonts w:ascii="Times New Roman" w:hAnsi="Times New Roman" w:cs="Times New Roman"/>
+          <w:sz w:val="28"/>
+          <w:szCs w:val="28"/>
+        </w:rPr>
+        <w:t>Горбатюк</w:t>
+      </w:r>
+      <w:proofErr w:type="spellEnd"/>
+      <w:r>
+        <w:rPr>
+          <w:rFonts w:ascii="Times New Roman" w:hAnsi="Times New Roman" w:cs="Times New Roman"/>
+          <w:sz w:val="28"/>
+          <w:szCs w:val="28"/>
+        </w:rPr>
+        <w:t xml:space="preserve">, Л. В., Кравченко, Н. В., &amp; </w:t>
+      </w:r>
+      <w:proofErr w:type="spellStart"/>
+      <w:r>
+        <w:rPr>
+          <w:rFonts w:ascii="Times New Roman" w:hAnsi="Times New Roman" w:cs="Times New Roman"/>
+          <w:sz w:val="28"/>
+          <w:szCs w:val="28"/>
+        </w:rPr>
+        <w:t>Кортез</w:t>
+      </w:r>
+      <w:proofErr w:type="spellEnd"/>
+      <w:r>
+        <w:rPr>
+          <w:rFonts w:ascii="Times New Roman" w:hAnsi="Times New Roman" w:cs="Times New Roman"/>
+          <w:sz w:val="28"/>
+          <w:szCs w:val="28"/>
+        </w:rPr>
+        <w:t xml:space="preserve">, Х. І.  (2024).  </w:t>
+      </w:r>
+      <w:proofErr w:type="spellStart"/>
+      <w:proofErr w:type="gramStart"/>
+      <w:r>
+        <w:rPr>
+          <w:rFonts w:ascii="Times New Roman" w:hAnsi="Times New Roman" w:cs="Times New Roman"/>
+          <w:sz w:val="28"/>
+          <w:szCs w:val="28"/>
+        </w:rPr>
+        <w:t>Гейміфікація</w:t>
+      </w:r>
+      <w:proofErr w:type="spellEnd"/>
+      <w:r>
+        <w:rPr>
+          <w:rFonts w:ascii="Times New Roman" w:hAnsi="Times New Roman" w:cs="Times New Roman"/>
+          <w:sz w:val="28"/>
+          <w:szCs w:val="28"/>
+        </w:rPr>
+        <w:t xml:space="preserve">  як</w:t>
+      </w:r>
+      <w:proofErr w:type="gramEnd"/>
+      <w:r>
+        <w:rPr>
+          <w:rFonts w:ascii="Times New Roman" w:hAnsi="Times New Roman" w:cs="Times New Roman"/>
+          <w:sz w:val="28"/>
+          <w:szCs w:val="28"/>
+        </w:rPr>
+        <w:t xml:space="preserve">  один  </w:t>
+      </w:r>
+      <w:proofErr w:type="spellStart"/>
+      <w:r>
+        <w:rPr>
+          <w:rFonts w:ascii="Times New Roman" w:hAnsi="Times New Roman" w:cs="Times New Roman"/>
+          <w:sz w:val="28"/>
+          <w:szCs w:val="28"/>
+        </w:rPr>
+        <w:t>із</w:t>
+      </w:r>
+      <w:proofErr w:type="spellEnd"/>
+      <w:r>
+        <w:rPr>
+          <w:rFonts w:ascii="Times New Roman" w:hAnsi="Times New Roman" w:cs="Times New Roman"/>
+          <w:sz w:val="28"/>
+          <w:szCs w:val="28"/>
+        </w:rPr>
+        <w:t xml:space="preserve">  </w:t>
+      </w:r>
+      <w:proofErr w:type="spellStart"/>
+      <w:r>
+        <w:rPr>
+          <w:rFonts w:ascii="Times New Roman" w:hAnsi="Times New Roman" w:cs="Times New Roman"/>
+          <w:sz w:val="28"/>
+          <w:szCs w:val="28"/>
+        </w:rPr>
+        <w:t>трендів</w:t>
+      </w:r>
+      <w:proofErr w:type="spellEnd"/>
+      <w:r>
+        <w:rPr>
+          <w:rFonts w:ascii="Times New Roman" w:hAnsi="Times New Roman" w:cs="Times New Roman"/>
+          <w:sz w:val="28"/>
+          <w:szCs w:val="28"/>
+        </w:rPr>
+        <w:t xml:space="preserve">  </w:t>
+      </w:r>
+      <w:proofErr w:type="spellStart"/>
+      <w:r>
+        <w:rPr>
+          <w:rFonts w:ascii="Times New Roman" w:hAnsi="Times New Roman" w:cs="Times New Roman"/>
+          <w:sz w:val="28"/>
+          <w:szCs w:val="28"/>
+        </w:rPr>
+        <w:t>сучасної</w:t>
+      </w:r>
+      <w:proofErr w:type="spellEnd"/>
+      <w:r>
+        <w:rPr>
+          <w:rFonts w:ascii="Times New Roman" w:hAnsi="Times New Roman" w:cs="Times New Roman"/>
+          <w:sz w:val="28"/>
+          <w:szCs w:val="28"/>
+        </w:rPr>
+        <w:t xml:space="preserve">  </w:t>
+      </w:r>
+      <w:proofErr w:type="spellStart"/>
+      <w:r>
+        <w:rPr>
+          <w:rFonts w:ascii="Times New Roman" w:hAnsi="Times New Roman" w:cs="Times New Roman"/>
+          <w:sz w:val="28"/>
+          <w:szCs w:val="28"/>
+        </w:rPr>
+        <w:t>освіти</w:t>
+      </w:r>
+      <w:proofErr w:type="spellEnd"/>
+      <w:r>
+        <w:rPr>
+          <w:rFonts w:ascii="Times New Roman" w:hAnsi="Times New Roman" w:cs="Times New Roman"/>
+          <w:sz w:val="28"/>
+          <w:szCs w:val="28"/>
+        </w:rPr>
+        <w:t xml:space="preserve">.  </w:t>
+      </w:r>
+      <w:proofErr w:type="gramStart"/>
+      <w:r>
+        <w:rPr>
+          <w:rFonts w:ascii="Times New Roman" w:hAnsi="Times New Roman" w:cs="Times New Roman"/>
+          <w:sz w:val="28"/>
+          <w:szCs w:val="28"/>
+        </w:rPr>
+        <w:t>Молодь  і</w:t>
+      </w:r>
+      <w:proofErr w:type="gramEnd"/>
+      <w:r>
+        <w:rPr>
+          <w:rFonts w:ascii="Times New Roman" w:hAnsi="Times New Roman" w:cs="Times New Roman"/>
+          <w:sz w:val="28"/>
+          <w:szCs w:val="28"/>
+        </w:rPr>
+        <w:t xml:space="preserve">  </w:t>
+      </w:r>
+      <w:proofErr w:type="spellStart"/>
+      <w:r>
+        <w:rPr>
+          <w:rFonts w:ascii="Times New Roman" w:hAnsi="Times New Roman" w:cs="Times New Roman"/>
+          <w:sz w:val="28"/>
+          <w:szCs w:val="28"/>
+        </w:rPr>
+        <w:t>ринок</w:t>
+      </w:r>
+      <w:proofErr w:type="spellEnd"/>
+      <w:r>
+        <w:rPr>
+          <w:rFonts w:ascii="Times New Roman" w:hAnsi="Times New Roman" w:cs="Times New Roman"/>
+          <w:sz w:val="28"/>
+          <w:szCs w:val="28"/>
+        </w:rPr>
+        <w:t xml:space="preserve">  : </w:t>
+      </w:r>
+      <w:proofErr w:type="spellStart"/>
+      <w:r>
+        <w:rPr>
+          <w:rFonts w:ascii="Times New Roman" w:hAnsi="Times New Roman" w:cs="Times New Roman"/>
+          <w:sz w:val="28"/>
+          <w:szCs w:val="28"/>
+        </w:rPr>
+        <w:t>науково-педагогічний</w:t>
+      </w:r>
+      <w:proofErr w:type="spellEnd"/>
+      <w:r>
+        <w:rPr>
+          <w:rFonts w:ascii="Times New Roman" w:hAnsi="Times New Roman" w:cs="Times New Roman"/>
+          <w:sz w:val="28"/>
+          <w:szCs w:val="28"/>
+        </w:rPr>
+        <w:t xml:space="preserve"> журнал, 4 (224), 82–87.</w:t>
       </w:r>
     </w:p>
     <w:p>
@@ -1836,14 +2724,85 @@
         </w:rPr>
         <w:t xml:space="preserve">[8] </w:t>
       </w:r>
-      <w:r>
-        <w:rPr>
-          <w:rFonts w:ascii="Times New Roman" w:hAnsi="Times New Roman" w:cs="Times New Roman"/>
-          <w:sz w:val="28"/>
-          <w:szCs w:val="28"/>
-          <w:lang w:val="en-US"/>
-        </w:rPr>
-        <w:t>Milutinovic, Verica &amp; Obradovic, Ivana &amp; Đorđević, Suzana. (2025). EXPLORING PRIMARY SCHOOL STUDENTS’ MOTIVATION AND ENJOYMENT IN LEARNING PROGRAMMING THROUGH GAMIFICATION. 231-244. 10.46793/STREAM25.231M.</w:t>
+      <w:proofErr w:type="spellStart"/>
+      <w:r>
+        <w:rPr>
+          <w:rFonts w:ascii="Times New Roman" w:hAnsi="Times New Roman" w:cs="Times New Roman"/>
+          <w:sz w:val="28"/>
+          <w:szCs w:val="28"/>
+          <w:lang w:val="en-US"/>
+        </w:rPr>
+        <w:t>Milutinovic</w:t>
+      </w:r>
+      <w:proofErr w:type="spellEnd"/>
+      <w:r>
+        <w:rPr>
+          <w:rFonts w:ascii="Times New Roman" w:hAnsi="Times New Roman" w:cs="Times New Roman"/>
+          <w:sz w:val="28"/>
+          <w:szCs w:val="28"/>
+          <w:lang w:val="en-US"/>
+        </w:rPr>
+        <w:t xml:space="preserve">, Verica &amp; </w:t>
+      </w:r>
+      <w:proofErr w:type="spellStart"/>
+      <w:r>
+        <w:rPr>
+          <w:rFonts w:ascii="Times New Roman" w:hAnsi="Times New Roman" w:cs="Times New Roman"/>
+          <w:sz w:val="28"/>
+          <w:szCs w:val="28"/>
+          <w:lang w:val="en-US"/>
+        </w:rPr>
+        <w:t>Obradovic</w:t>
+      </w:r>
+      <w:proofErr w:type="spellEnd"/>
+      <w:r>
+        <w:rPr>
+          <w:rFonts w:ascii="Times New Roman" w:hAnsi="Times New Roman" w:cs="Times New Roman"/>
+          <w:sz w:val="28"/>
+          <w:szCs w:val="28"/>
+          <w:lang w:val="en-US"/>
+        </w:rPr>
+        <w:t xml:space="preserve">, Ivana &amp; </w:t>
+      </w:r>
+      <w:proofErr w:type="spellStart"/>
+      <w:r>
+        <w:rPr>
+          <w:rFonts w:ascii="Times New Roman" w:hAnsi="Times New Roman" w:cs="Times New Roman"/>
+          <w:sz w:val="28"/>
+          <w:szCs w:val="28"/>
+          <w:lang w:val="en-US"/>
+        </w:rPr>
+        <w:t>Đorđević</w:t>
+      </w:r>
+      <w:proofErr w:type="spellEnd"/>
+      <w:r>
+        <w:rPr>
+          <w:rFonts w:ascii="Times New Roman" w:hAnsi="Times New Roman" w:cs="Times New Roman"/>
+          <w:sz w:val="28"/>
+          <w:szCs w:val="28"/>
+          <w:lang w:val="en-US"/>
+        </w:rPr>
+        <w:t xml:space="preserve">, </w:t>
+      </w:r>
+      <w:proofErr w:type="spellStart"/>
+      <w:r>
+        <w:rPr>
+          <w:rFonts w:ascii="Times New Roman" w:hAnsi="Times New Roman" w:cs="Times New Roman"/>
+          <w:sz w:val="28"/>
+          <w:szCs w:val="28"/>
+          <w:lang w:val="en-US"/>
+        </w:rPr>
+        <w:t>Suzana</w:t>
+      </w:r>
+      <w:proofErr w:type="spellEnd"/>
+      <w:r>
+        <w:rPr>
+          <w:rFonts w:ascii="Times New Roman" w:hAnsi="Times New Roman" w:cs="Times New Roman"/>
+          <w:sz w:val="28"/>
+          <w:szCs w:val="28"/>
+          <w:lang w:val="en-US"/>
+        </w:rPr>
+        <w:t>. (2025). EXPLORING PRIMARY SCHOOL STUDENTS’ MOTIVATION AND ENJOYMENT IN LEARNING PROGRAMMING THROUGH GAMIFICATION. 231-244. 10.46793/STREAM25.231M.</w:t>
       </w:r>
     </w:p>
     <w:p>
@@ -1964,7 +2923,51 @@
           <w:szCs w:val="28"/>
           <w:lang w:val="en-US"/>
         </w:rPr>
-        <w:t>[15] "Getting Started with Domain-Specific Languages," Microsoft Learn, accessed Feb. 2026.</w:t>
+        <w:t xml:space="preserve">[16] F. </w:t>
+      </w:r>
+      <w:proofErr w:type="spellStart"/>
+      <w:r>
+        <w:rPr>
+          <w:rStyle w:val="normaltextrun"/>
+          <w:rFonts w:eastAsiaTheme="majorEastAsia"/>
+          <w:sz w:val="28"/>
+          <w:szCs w:val="28"/>
+          <w:lang w:val="en-US"/>
+        </w:rPr>
+        <w:t>Tomassetti</w:t>
+      </w:r>
+      <w:proofErr w:type="spellEnd"/>
+      <w:r>
+        <w:rPr>
+          <w:rStyle w:val="normaltextrun"/>
+          <w:rFonts w:eastAsiaTheme="majorEastAsia"/>
+          <w:sz w:val="28"/>
+          <w:szCs w:val="28"/>
+          <w:lang w:val="en-US"/>
+        </w:rPr>
+        <w:t>, "The complete guide to (external) Domain Specific Languages," </w:t>
+      </w:r>
+      <w:proofErr w:type="spellStart"/>
+      <w:r>
+        <w:rPr>
+          <w:rStyle w:val="normaltextrun"/>
+          <w:rFonts w:eastAsiaTheme="majorEastAsia"/>
+          <w:sz w:val="28"/>
+          <w:szCs w:val="28"/>
+          <w:lang w:val="en-US"/>
+        </w:rPr>
+        <w:t>Strumenta</w:t>
+      </w:r>
+      <w:proofErr w:type="spellEnd"/>
+      <w:r>
+        <w:rPr>
+          <w:rStyle w:val="normaltextrun"/>
+          <w:rFonts w:eastAsiaTheme="majorEastAsia"/>
+          <w:sz w:val="28"/>
+          <w:szCs w:val="28"/>
+          <w:lang w:val="en-US"/>
+        </w:rPr>
+        <w:t>, Aug. 2023.</w:t>
       </w:r>
       <w:r>
         <w:rPr>
@@ -1995,7 +2998,61 @@
           <w:szCs w:val="28"/>
           <w:lang w:val="en-US"/>
         </w:rPr>
-        <w:t>[16] F. Tomassetti, "The complete guide to (external) Domain Specific Languages," Strumenta, Aug. 2023.</w:t>
+        <w:t xml:space="preserve"> </w:t>
+      </w:r>
+      <w:r>
+        <w:rPr>
+          <w:rStyle w:val="normaltextrun"/>
+          <w:rFonts w:eastAsiaTheme="majorEastAsia"/>
+          <w:sz w:val="28"/>
+          <w:szCs w:val="28"/>
+          <w:lang w:val="en-US"/>
+        </w:rPr>
+        <w:t>[18] M. </w:t>
+      </w:r>
+      <w:proofErr w:type="spellStart"/>
+      <w:r>
+        <w:rPr>
+          <w:rStyle w:val="normaltextrun"/>
+          <w:rFonts w:eastAsiaTheme="majorEastAsia"/>
+          <w:sz w:val="28"/>
+          <w:szCs w:val="28"/>
+          <w:lang w:val="en-US"/>
+        </w:rPr>
+        <w:t>Guzdial</w:t>
+      </w:r>
+      <w:proofErr w:type="spellEnd"/>
+      <w:r>
+        <w:rPr>
+          <w:rStyle w:val="normaltextrun"/>
+          <w:rFonts w:eastAsiaTheme="majorEastAsia"/>
+          <w:sz w:val="28"/>
+          <w:szCs w:val="28"/>
+          <w:lang w:val="en-US"/>
+        </w:rPr>
+        <w:t xml:space="preserve">, "Software-Realized Scaffolding to Facilitate Programming for Science Learning," </w:t>
+      </w:r>
+      <w:proofErr w:type="spellStart"/>
+      <w:r>
+        <w:rPr>
+          <w:rStyle w:val="normaltextrun"/>
+          <w:rFonts w:eastAsiaTheme="majorEastAsia"/>
+          <w:sz w:val="28"/>
+          <w:szCs w:val="28"/>
+          <w:lang w:val="en-US"/>
+        </w:rPr>
+        <w:t>ResearchGate</w:t>
+      </w:r>
+      <w:proofErr w:type="spellEnd"/>
+      <w:r>
+        <w:rPr>
+          <w:rStyle w:val="normaltextrun"/>
+          <w:rFonts w:eastAsiaTheme="majorEastAsia"/>
+          <w:sz w:val="28"/>
+          <w:szCs w:val="28"/>
+          <w:lang w:val="en-US"/>
+        </w:rPr>
+        <w:t>, Dec. 1999.</w:t>
       </w:r>
       <w:r>
         <w:rPr>
@@ -2026,7 +3083,29 @@
           <w:szCs w:val="28"/>
           <w:lang w:val="en-US"/>
         </w:rPr>
-        <w:t>[17] M. Guzdial, "Software-Realized Scaffolding to Facilitate Programming for Science Learning," Interactive Learning Environments, vol. 4, no. 1, 1994.</w:t>
+        <w:t xml:space="preserve">[19] P. </w:t>
+      </w:r>
+      <w:proofErr w:type="spellStart"/>
+      <w:r>
+        <w:rPr>
+          <w:rStyle w:val="normaltextrun"/>
+          <w:rFonts w:eastAsiaTheme="majorEastAsia"/>
+          <w:sz w:val="28"/>
+          <w:szCs w:val="28"/>
+          <w:lang w:val="en-US"/>
+        </w:rPr>
+        <w:t>Gu</w:t>
+      </w:r>
+      <w:proofErr w:type="spellEnd"/>
+      <w:r>
+        <w:rPr>
+          <w:rStyle w:val="normaltextrun"/>
+          <w:rFonts w:eastAsiaTheme="majorEastAsia"/>
+          <w:sz w:val="28"/>
+          <w:szCs w:val="28"/>
+          <w:lang w:val="en-US"/>
+        </w:rPr>
+        <w:t xml:space="preserve"> et al., "Scaffolding self-regulation in project-based programming learning through online collaborative diaries to promote computational thinking," Education and Information Technologies, vol. 30, pp. 16243-16267, Feb. 2025.</w:t>
       </w:r>
       <w:r>
         <w:rPr>
@@ -2057,7 +3136,29 @@
           <w:szCs w:val="28"/>
           <w:lang w:val="en-US"/>
         </w:rPr>
-        <w:t>[18] M. Guzdial, "Software-Realized Scaffolding to Facilitate Programming for Science Learning," ResearchGate, Dec. 1999.</w:t>
+        <w:t>[20] J. Zhang et al., "Scaffolding Metacognition in Programming Education: Understanding Student-AI Interactions and Design Implications," </w:t>
+      </w:r>
+      <w:proofErr w:type="spellStart"/>
+      <w:r>
+        <w:rPr>
+          <w:rStyle w:val="normaltextrun"/>
+          <w:rFonts w:eastAsiaTheme="majorEastAsia"/>
+          <w:sz w:val="28"/>
+          <w:szCs w:val="28"/>
+          <w:lang w:val="en-US"/>
+        </w:rPr>
+        <w:t>arXiv</w:t>
+      </w:r>
+      <w:proofErr w:type="spellEnd"/>
+      <w:r>
+        <w:rPr>
+          <w:rStyle w:val="normaltextrun"/>
+          <w:rFonts w:eastAsiaTheme="majorEastAsia"/>
+          <w:sz w:val="28"/>
+          <w:szCs w:val="28"/>
+          <w:lang w:val="en-US"/>
+        </w:rPr>
+        <w:t>, Nov. 2025.</w:t>
       </w:r>
       <w:r>
         <w:rPr>
@@ -2088,7 +3189,29 @@
           <w:szCs w:val="28"/>
           <w:lang w:val="en-US"/>
         </w:rPr>
-        <w:t>[19] P. Gu et al., "Scaffolding self-regulation in project-based programming learning through online collaborative diaries to promote computational thinking," Education and Information Technologies, vol. 30, pp. 16243-16267, Feb. 2025.</w:t>
+        <w:t xml:space="preserve">[21] M. </w:t>
+      </w:r>
+      <w:proofErr w:type="spellStart"/>
+      <w:r>
+        <w:rPr>
+          <w:rStyle w:val="normaltextrun"/>
+          <w:rFonts w:eastAsiaTheme="majorEastAsia"/>
+          <w:sz w:val="28"/>
+          <w:szCs w:val="28"/>
+          <w:lang w:val="en-US"/>
+        </w:rPr>
+        <w:t>Hannafin</w:t>
+      </w:r>
+      <w:proofErr w:type="spellEnd"/>
+      <w:r>
+        <w:rPr>
+          <w:rStyle w:val="normaltextrun"/>
+          <w:rFonts w:eastAsiaTheme="majorEastAsia"/>
+          <w:sz w:val="28"/>
+          <w:szCs w:val="28"/>
+          <w:lang w:val="en-US"/>
+        </w:rPr>
+        <w:t xml:space="preserve"> et al., "A Framework for Designing Scaffolds That Improve Motivation and Cognition," PMC, accessed Feb. 2026.</w:t>
       </w:r>
       <w:r>
         <w:rPr>
@@ -2106,6 +3229,7 @@
         <w:spacing w:before="0" w:beforeAutospacing="0" w:after="0" w:afterAutospacing="0"/>
         <w:textAlignment w:val="baseline"/>
         <w:rPr>
+          <w:rStyle w:val="eop"/>
           <w:sz w:val="28"/>
           <w:szCs w:val="28"/>
           <w:lang w:val="en-US"/>
@@ -2119,29 +3243,9 @@
           <w:szCs w:val="28"/>
           <w:lang w:val="en-US"/>
         </w:rPr>
-        <w:t>[20] J. Zhang et al., "Scaffolding Metacognition in Programming Education: Understanding Student-AI Interactions and Design Implications," arXiv, Nov. 2025.</w:t>
-      </w:r>
-      <w:r>
-        <w:rPr>
-          <w:rStyle w:val="eop"/>
-          <w:sz w:val="28"/>
-          <w:szCs w:val="28"/>
-          <w:lang w:val="en-US"/>
-        </w:rPr>
-        <w:t> </w:t>
-      </w:r>
-    </w:p>
-    <w:p>
-      <w:pPr>
-        <w:pStyle w:val="paragraph"/>
-        <w:spacing w:before="0" w:beforeAutospacing="0" w:after="0" w:afterAutospacing="0"/>
-        <w:textAlignment w:val="baseline"/>
-        <w:rPr>
-          <w:sz w:val="28"/>
-          <w:szCs w:val="28"/>
-          <w:lang w:val="en-US"/>
-        </w:rPr>
-      </w:pPr>
+        <w:t xml:space="preserve">[22] A. </w:t>
+      </w:r>
+      <w:proofErr w:type="spellStart"/>
       <w:r>
         <w:rPr>
           <w:rStyle w:val="normaltextrun"/>
@@ -2150,30 +3254,9 @@
           <w:szCs w:val="28"/>
           <w:lang w:val="en-US"/>
         </w:rPr>
-        <w:t>[21] M. Hannafin et al., "A Framework for Designing Scaffolds That Improve Motivation and Cognition," PMC, accessed Feb. 2026.</w:t>
-      </w:r>
-      <w:r>
-        <w:rPr>
-          <w:rStyle w:val="eop"/>
-          <w:sz w:val="28"/>
-          <w:szCs w:val="28"/>
-          <w:lang w:val="en-US"/>
-        </w:rPr>
-        <w:t> </w:t>
-      </w:r>
-    </w:p>
-    <w:p>
-      <w:pPr>
-        <w:pStyle w:val="paragraph"/>
-        <w:spacing w:before="0" w:beforeAutospacing="0" w:after="0" w:afterAutospacing="0"/>
-        <w:textAlignment w:val="baseline"/>
-        <w:rPr>
-          <w:rStyle w:val="eop"/>
-          <w:sz w:val="28"/>
-          <w:szCs w:val="28"/>
-          <w:lang w:val="en-US"/>
-        </w:rPr>
-      </w:pPr>
+        <w:t>Repenning</w:t>
+      </w:r>
+      <w:proofErr w:type="spellEnd"/>
       <w:r>
         <w:rPr>
           <w:rStyle w:val="normaltextrun"/>
@@ -2182,7 +3265,7 @@
           <w:szCs w:val="28"/>
           <w:lang w:val="en-US"/>
         </w:rPr>
-        <w:t>[22] A. Repenning et al., "Scaffolding Creative Programming Projects," ACM Digital Library, accessed Feb. 2026.</w:t>
+        <w:t xml:space="preserve"> et al., "Scaffolding Creative Programming Projects," ACM Digital Library, accessed Feb. 2026.</w:t>
       </w:r>
     </w:p>
     <w:p>
@@ -3020,7 +4103,25 @@
             <w:color w:val="auto"/>
             <w:lang w:val="en-US"/>
           </w:rPr>
-          <w:t>https://mural.maynoothuniversity.ie/id/eprint/11040/1/VisTex.pdf</w:t>
+          <w:t>https://mural.maynoothuniversity.ie/id/eprint/11040/1</w:t>
+        </w:r>
+        <w:r>
+          <w:rPr>
+            <w:rStyle w:val="a4"/>
+            <w:rFonts w:ascii="Arial" w:eastAsiaTheme="majorEastAsia" w:hAnsi="Arial" w:cs="Arial"/>
+            <w:color w:val="auto"/>
+            <w:lang w:val="en-US"/>
+          </w:rPr>
+          <w:t>/</w:t>
+        </w:r>
+        <w:r>
+          <w:rPr>
+            <w:rStyle w:val="a4"/>
+            <w:rFonts w:ascii="Arial" w:eastAsiaTheme="majorEastAsia" w:hAnsi="Arial" w:cs="Arial"/>
+            <w:color w:val="auto"/>
+            <w:lang w:val="en-US"/>
+          </w:rPr>
+          <w:t>VisTex.pdf</w:t>
         </w:r>
       </w:hyperlink>
     </w:p>
@@ -3085,7 +4186,43 @@
             <w:color w:val="auto"/>
             <w:lang w:val="en-US"/>
           </w:rPr>
-          <w:t>https://www.researchgate.net/publication/320656758_Comparison_of_Text-Based_and_Visual-Based_Programming_Input_Methods_for_First-Time_Learners</w:t>
+          <w:t>https://www.res</w:t>
+        </w:r>
+        <w:r>
+          <w:rPr>
+            <w:rStyle w:val="a4"/>
+            <w:rFonts w:ascii="Arial" w:eastAsiaTheme="majorEastAsia" w:hAnsi="Arial" w:cs="Arial"/>
+            <w:color w:val="auto"/>
+            <w:lang w:val="en-US"/>
+          </w:rPr>
+          <w:t>e</w:t>
+        </w:r>
+        <w:r>
+          <w:rPr>
+            <w:rStyle w:val="a4"/>
+            <w:rFonts w:ascii="Arial" w:eastAsiaTheme="majorEastAsia" w:hAnsi="Arial" w:cs="Arial"/>
+            <w:color w:val="auto"/>
+            <w:lang w:val="en-US"/>
+          </w:rPr>
+          <w:t>archgate.n</w:t>
+        </w:r>
+        <w:r>
+          <w:rPr>
+            <w:rStyle w:val="a4"/>
+            <w:rFonts w:ascii="Arial" w:eastAsiaTheme="majorEastAsia" w:hAnsi="Arial" w:cs="Arial"/>
+            <w:color w:val="auto"/>
+            <w:lang w:val="en-US"/>
+          </w:rPr>
+          <w:t>e</w:t>
+        </w:r>
+        <w:r>
+          <w:rPr>
+            <w:rStyle w:val="a4"/>
+            <w:rFonts w:ascii="Arial" w:eastAsiaTheme="majorEastAsia" w:hAnsi="Arial" w:cs="Arial"/>
+            <w:color w:val="auto"/>
+            <w:lang w:val="en-US"/>
+          </w:rPr>
+          <w:t>t/publication/320656758_Comparison_of_Text-Based_and_Visual-Based_Programming_Input_Methods_for_First-Time_Learners</w:t>
         </w:r>
       </w:hyperlink>
     </w:p>
@@ -3132,7 +4269,25 @@
             <w:color w:val="auto"/>
             <w:lang w:val="en-US"/>
           </w:rPr>
-          <w:t>https://www.jcscm.net/fp/194.pdf</w:t>
+          <w:t>https://www.jcscm.net/fp/</w:t>
+        </w:r>
+        <w:r>
+          <w:rPr>
+            <w:rStyle w:val="a4"/>
+            <w:rFonts w:ascii="Arial" w:eastAsiaTheme="majorEastAsia" w:hAnsi="Arial" w:cs="Arial"/>
+            <w:color w:val="auto"/>
+            <w:lang w:val="en-US"/>
+          </w:rPr>
+          <w:t>1</w:t>
+        </w:r>
+        <w:r>
+          <w:rPr>
+            <w:rStyle w:val="a4"/>
+            <w:rFonts w:ascii="Arial" w:eastAsiaTheme="majorEastAsia" w:hAnsi="Arial" w:cs="Arial"/>
+            <w:color w:val="auto"/>
+            <w:lang w:val="en-US"/>
+          </w:rPr>
+          <w:t>94.pdf</w:t>
         </w:r>
       </w:hyperlink>
       <w:r>
@@ -3185,7 +4340,25 @@
             <w:color w:val="auto"/>
             <w:lang w:val="en-US"/>
           </w:rPr>
-          <w:t>https://arxiv.org/html/2504.16644v1</w:t>
+          <w:t>https://arxiv.org/ht</w:t>
+        </w:r>
+        <w:r>
+          <w:rPr>
+            <w:rStyle w:val="a4"/>
+            <w:rFonts w:ascii="Arial" w:eastAsiaTheme="majorEastAsia" w:hAnsi="Arial" w:cs="Arial"/>
+            <w:color w:val="auto"/>
+            <w:lang w:val="en-US"/>
+          </w:rPr>
+          <w:t>m</w:t>
+        </w:r>
+        <w:r>
+          <w:rPr>
+            <w:rStyle w:val="a4"/>
+            <w:rFonts w:ascii="Arial" w:eastAsiaTheme="majorEastAsia" w:hAnsi="Arial" w:cs="Arial"/>
+            <w:color w:val="auto"/>
+            <w:lang w:val="en-US"/>
+          </w:rPr>
+          <w:t>l/2504.16644v1</w:t>
         </w:r>
       </w:hyperlink>
     </w:p>
@@ -3268,7 +4441,25 @@
             <w:color w:val="auto"/>
             <w:lang w:val="en-US"/>
           </w:rPr>
-          <w:t>https://www.cs.unm.edu/~learningcomputing/readings/17_weintrop_wilensky.pdf</w:t>
+          <w:t>https://www.cs.u</w:t>
+        </w:r>
+        <w:r>
+          <w:rPr>
+            <w:rStyle w:val="a4"/>
+            <w:rFonts w:ascii="Arial" w:eastAsiaTheme="majorEastAsia" w:hAnsi="Arial" w:cs="Arial"/>
+            <w:color w:val="auto"/>
+            <w:lang w:val="en-US"/>
+          </w:rPr>
+          <w:t>n</w:t>
+        </w:r>
+        <w:r>
+          <w:rPr>
+            <w:rStyle w:val="a4"/>
+            <w:rFonts w:ascii="Arial" w:eastAsiaTheme="majorEastAsia" w:hAnsi="Arial" w:cs="Arial"/>
+            <w:color w:val="auto"/>
+            <w:lang w:val="en-US"/>
+          </w:rPr>
+          <w:t>m.edu/~learningcomputing/readings/17_weintrop_wilensky.pdf</w:t>
         </w:r>
       </w:hyperlink>
     </w:p>
@@ -3315,7 +4506,25 @@
             <w:color w:val="auto"/>
             <w:lang w:val="en-US"/>
           </w:rPr>
-          <w:t>https://files.eric.ed.gov/fulltext/EJ1465535.pdf</w:t>
+          <w:t>https://files.eric.ed.</w:t>
+        </w:r>
+        <w:r>
+          <w:rPr>
+            <w:rStyle w:val="a4"/>
+            <w:rFonts w:ascii="Arial" w:eastAsiaTheme="majorEastAsia" w:hAnsi="Arial" w:cs="Arial"/>
+            <w:color w:val="auto"/>
+            <w:lang w:val="en-US"/>
+          </w:rPr>
+          <w:t>g</w:t>
+        </w:r>
+        <w:r>
+          <w:rPr>
+            <w:rStyle w:val="a4"/>
+            <w:rFonts w:ascii="Arial" w:eastAsiaTheme="majorEastAsia" w:hAnsi="Arial" w:cs="Arial"/>
+            <w:color w:val="auto"/>
+            <w:lang w:val="en-US"/>
+          </w:rPr>
+          <w:t>ov/fulltext/EJ1465535.pdf</w:t>
         </w:r>
       </w:hyperlink>
     </w:p>
@@ -3362,7 +4571,25 @@
             <w:color w:val="auto"/>
             <w:lang w:val="en-US"/>
           </w:rPr>
-          <w:t>https://ecepalliance.org/resources/models/stakeholders-involved-bpc/</w:t>
+          <w:t>https://ecepall</w:t>
+        </w:r>
+        <w:r>
+          <w:rPr>
+            <w:rStyle w:val="a4"/>
+            <w:rFonts w:ascii="Arial" w:eastAsiaTheme="majorEastAsia" w:hAnsi="Arial" w:cs="Arial"/>
+            <w:color w:val="auto"/>
+            <w:lang w:val="en-US"/>
+          </w:rPr>
+          <w:t>i</w:t>
+        </w:r>
+        <w:r>
+          <w:rPr>
+            <w:rStyle w:val="a4"/>
+            <w:rFonts w:ascii="Arial" w:eastAsiaTheme="majorEastAsia" w:hAnsi="Arial" w:cs="Arial"/>
+            <w:color w:val="auto"/>
+            <w:lang w:val="en-US"/>
+          </w:rPr>
+          <w:t>ance.org/resources/models/stakeholders-involved-bpc/</w:t>
         </w:r>
       </w:hyperlink>
     </w:p>
@@ -3459,41 +4686,149 @@
           <w:sz w:val="28"/>
           <w:lang w:val="en-US"/>
         </w:rPr>
-        <w:t>Minecraft offers an interactive digital environment that closely aligns with core programming and computational thinking concepts. Actions performed by players occur in a clear sequence, which reflects the execution of instructions in imperative programming. Repetitive gameplay activities such as mining blocks, farming resources, or crafting items correspond to loop structures, where the same operation is repeated until a specific condition is satisfied. Decision-making in response to in-game situations, including reacting to nightfall, selecting appropriate tools, or avoiding hostile entities, mirrors conditional logic used in programming. Managing inventory items is similar to dealing with variables that change over time, while recurring building patterns and construction methods resemble the use of procedures and modular design. In-game events such as mob spawning or environmental changes parallel event-driven programming models. These conceptual parallels have been identified and discussed in multiple studies examining the educational use of Minecraft in STEM and computational thinking contexts (Shamsudin et al., 2024; Nebel et al., 2020).</w:t>
-      </w:r>
-    </w:p>
-    <w:p>
-      <w:pPr>
-        <w:rPr>
-          <w:rFonts w:ascii="Times New Roman" w:hAnsi="Times New Roman" w:cs="Times New Roman"/>
-          <w:sz w:val="28"/>
-          <w:lang w:val="en-US"/>
-        </w:rPr>
-      </w:pPr>
-      <w:r>
-        <w:rPr>
-          <w:rFonts w:ascii="Times New Roman" w:hAnsi="Times New Roman" w:cs="Times New Roman"/>
-          <w:sz w:val="28"/>
-          <w:lang w:val="en-US"/>
-        </w:rPr>
-        <w:t>Empirical evidence supports the effectiveness of Minecraft for developing computational thinking when its use is structured and guided. A study focusing on Minecraft-based coding activities with middle school students reported statistically significant improvements in computational thinking dimensions such as sequencing, loops, conditionals, events, and parallelism following a structured instructional intervention (Tablatin et al., 2023). Systematic reviews of empirical studies from the past decade also find that Minecraft can help learners grasp basic programming concepts, provided that learning goals and instructional support are clearly defined (Nebel et al., 2020; Shamsudin et al., 2024).</w:t>
-      </w:r>
-    </w:p>
-    <w:p>
-      <w:pPr>
-        <w:rPr>
-          <w:rFonts w:ascii="Times New Roman" w:hAnsi="Times New Roman" w:cs="Times New Roman"/>
-          <w:sz w:val="28"/>
-          <w:lang w:val="en-US"/>
-        </w:rPr>
-      </w:pPr>
-      <w:r>
-        <w:rPr>
-          <w:rFonts w:ascii="Times New Roman" w:hAnsi="Times New Roman" w:cs="Times New Roman"/>
-          <w:sz w:val="28"/>
-          <w:lang w:val="en-US"/>
-        </w:rPr>
-        <w:t>Minecraft has also seen substantial adoption in formal educational contexts, primarily through Minecraft Education Edition, which is designed specifically for classroom use. According to Microsoft Education, tens of millions of teachers and students across more than one hundred countries have access to licensed versions of the platform, indicating widespread institutional uptake rather than isolated experimentation (Microsoft, 2021). A systematic literature review covering studies published between 2015 and 2024 confirms that Minecraft has been implemented across primary and secondary education, most frequently within STEM subjects, and that many educators continue to use it beyond initial trials (Shamsudin et al., 2024). Although precise global percentages of schools using Minecraft are not consistently reported, the scale of adoption and the volume of peer-reviewed research demonstrate that Minecraft is an established educational platform.</w:t>
+        <w:t>Minecraft offers an interactive digital environment that closely aligns with core programming and computational thinking concepts. Actions performed by players occur in a clear sequence, which reflects the execution of instructions in imperative programming. Repetitive gameplay activities such as mining blocks, farming resources, or crafting items correspond to loop structures, where the same operation is repeated until a specific condition is satisfied. Decision-making in response to in-game situations, including reacting to nightfall, selecting appropriate tools, or avoiding hostile entities, mirrors conditional logic used in programming. Managing inventory items is similar to dealing with variables that change over time, while recurring building patterns and construction methods resemble the use of procedures and modular design. In-game events such as mob spawning or environmental changes parallel event-driven programming models. These conceptual parallels have been identified and discussed in multiple studies examining the educational use of Minecraft in STEM and computational thinking contexts (</w:t>
+      </w:r>
+      <w:proofErr w:type="spellStart"/>
+      <w:r>
+        <w:rPr>
+          <w:rFonts w:ascii="Times New Roman" w:hAnsi="Times New Roman" w:cs="Times New Roman"/>
+          <w:sz w:val="28"/>
+          <w:lang w:val="en-US"/>
+        </w:rPr>
+        <w:t>Shamsudin</w:t>
+      </w:r>
+      <w:proofErr w:type="spellEnd"/>
+      <w:r>
+        <w:rPr>
+          <w:rFonts w:ascii="Times New Roman" w:hAnsi="Times New Roman" w:cs="Times New Roman"/>
+          <w:sz w:val="28"/>
+          <w:lang w:val="en-US"/>
+        </w:rPr>
+        <w:t xml:space="preserve"> et al., 2024; </w:t>
+      </w:r>
+      <w:proofErr w:type="spellStart"/>
+      <w:r>
+        <w:rPr>
+          <w:rFonts w:ascii="Times New Roman" w:hAnsi="Times New Roman" w:cs="Times New Roman"/>
+          <w:sz w:val="28"/>
+          <w:lang w:val="en-US"/>
+        </w:rPr>
+        <w:t>Nebel</w:t>
+      </w:r>
+      <w:proofErr w:type="spellEnd"/>
+      <w:r>
+        <w:rPr>
+          <w:rFonts w:ascii="Times New Roman" w:hAnsi="Times New Roman" w:cs="Times New Roman"/>
+          <w:sz w:val="28"/>
+          <w:lang w:val="en-US"/>
+        </w:rPr>
+        <w:t xml:space="preserve"> et al., 2020).</w:t>
+      </w:r>
+    </w:p>
+    <w:p>
+      <w:pPr>
+        <w:rPr>
+          <w:rFonts w:ascii="Times New Roman" w:hAnsi="Times New Roman" w:cs="Times New Roman"/>
+          <w:sz w:val="28"/>
+          <w:lang w:val="en-US"/>
+        </w:rPr>
+      </w:pPr>
+      <w:r>
+        <w:rPr>
+          <w:rFonts w:ascii="Times New Roman" w:hAnsi="Times New Roman" w:cs="Times New Roman"/>
+          <w:sz w:val="28"/>
+          <w:lang w:val="en-US"/>
+        </w:rPr>
+        <w:t>Empirical evidence supports the effectiveness of Minecraft for developing computational thinking when its use is structured and guided. A study focusing on Minecraft-based coding activities with middle school students reported statistically significant improvements in computational thinking dimensions such as sequencing, loops, conditionals, events, and parallelism following a structured instructional intervention (</w:t>
+      </w:r>
+      <w:proofErr w:type="spellStart"/>
+      <w:r>
+        <w:rPr>
+          <w:rFonts w:ascii="Times New Roman" w:hAnsi="Times New Roman" w:cs="Times New Roman"/>
+          <w:sz w:val="28"/>
+          <w:lang w:val="en-US"/>
+        </w:rPr>
+        <w:t>Tablatin</w:t>
+      </w:r>
+      <w:proofErr w:type="spellEnd"/>
+      <w:r>
+        <w:rPr>
+          <w:rFonts w:ascii="Times New Roman" w:hAnsi="Times New Roman" w:cs="Times New Roman"/>
+          <w:sz w:val="28"/>
+          <w:lang w:val="en-US"/>
+        </w:rPr>
+        <w:t xml:space="preserve"> et al., 2023). Systematic reviews of empirical studies from the past decade also find that Minecraft can help learners grasp basic programming concepts, provided that learning goals and instructional support are clearly defined (</w:t>
+      </w:r>
+      <w:proofErr w:type="spellStart"/>
+      <w:r>
+        <w:rPr>
+          <w:rFonts w:ascii="Times New Roman" w:hAnsi="Times New Roman" w:cs="Times New Roman"/>
+          <w:sz w:val="28"/>
+          <w:lang w:val="en-US"/>
+        </w:rPr>
+        <w:t>Nebel</w:t>
+      </w:r>
+      <w:proofErr w:type="spellEnd"/>
+      <w:r>
+        <w:rPr>
+          <w:rFonts w:ascii="Times New Roman" w:hAnsi="Times New Roman" w:cs="Times New Roman"/>
+          <w:sz w:val="28"/>
+          <w:lang w:val="en-US"/>
+        </w:rPr>
+        <w:t xml:space="preserve"> et al., 2020; </w:t>
+      </w:r>
+      <w:proofErr w:type="spellStart"/>
+      <w:r>
+        <w:rPr>
+          <w:rFonts w:ascii="Times New Roman" w:hAnsi="Times New Roman" w:cs="Times New Roman"/>
+          <w:sz w:val="28"/>
+          <w:lang w:val="en-US"/>
+        </w:rPr>
+        <w:t>Shamsudin</w:t>
+      </w:r>
+      <w:proofErr w:type="spellEnd"/>
+      <w:r>
+        <w:rPr>
+          <w:rFonts w:ascii="Times New Roman" w:hAnsi="Times New Roman" w:cs="Times New Roman"/>
+          <w:sz w:val="28"/>
+          <w:lang w:val="en-US"/>
+        </w:rPr>
+        <w:t xml:space="preserve"> et al., 2024).</w:t>
+      </w:r>
+    </w:p>
+    <w:p>
+      <w:pPr>
+        <w:rPr>
+          <w:rFonts w:ascii="Times New Roman" w:hAnsi="Times New Roman" w:cs="Times New Roman"/>
+          <w:sz w:val="28"/>
+          <w:lang w:val="en-US"/>
+        </w:rPr>
+      </w:pPr>
+      <w:r>
+        <w:rPr>
+          <w:rFonts w:ascii="Times New Roman" w:hAnsi="Times New Roman" w:cs="Times New Roman"/>
+          <w:sz w:val="28"/>
+          <w:lang w:val="en-US"/>
+        </w:rPr>
+        <w:t>Minecraft has also seen substantial adoption in formal educational contexts, primarily through Minecraft Education Edition, which is designed specifically for classroom use. According to Microsoft Education, tens of millions of teachers and students across more than one hundred countries have access to licensed versions of the platform, indicating widespread institutional uptake rather than isolated experimentation (Microsoft, 2021). A systematic literature review covering studies published between 2015 and 2024 confirms that Minecraft has been implemented across primary and secondary education, most frequently within STEM subjects, and that many educators continue to use it beyond initial trials (</w:t>
+      </w:r>
+      <w:proofErr w:type="spellStart"/>
+      <w:r>
+        <w:rPr>
+          <w:rFonts w:ascii="Times New Roman" w:hAnsi="Times New Roman" w:cs="Times New Roman"/>
+          <w:sz w:val="28"/>
+          <w:lang w:val="en-US"/>
+        </w:rPr>
+        <w:t>Shamsudin</w:t>
+      </w:r>
+      <w:proofErr w:type="spellEnd"/>
+      <w:r>
+        <w:rPr>
+          <w:rFonts w:ascii="Times New Roman" w:hAnsi="Times New Roman" w:cs="Times New Roman"/>
+          <w:sz w:val="28"/>
+          <w:lang w:val="en-US"/>
+        </w:rPr>
+        <w:t xml:space="preserve"> et al., 2024). Although precise global percentages of schools using Minecraft are not consistently reported, the scale of adoption and the volume of peer-reviewed research demonstrate that Minecraft is an established educational platform.</w:t>
       </w:r>
     </w:p>
     <w:p>
@@ -3511,41 +4846,113 @@
           <w:lang w:val="en-US"/>
         </w:rPr>
         <w:lastRenderedPageBreak/>
-        <w:t>Research on the educational effectiveness of Minecraft consistently reports increased student engagement, motivation, and participation when the platform is integrated into structured learning activities. Studies grounded in constructivist and social constructivist learning theories highlight that Minecraft supports inquiry-based learning, problem solving, collaboration, and spatial reasoning (Short, 2012; Kotsopoulos et al., 2017). Experimental research further indicates that Minecraft-based interventions can lead to measurable improvements in spatial and cognitive skills, provided that instructional goals are explicit and teacher guidance is present (Zhang et al., 2021).</w:t>
-      </w:r>
-    </w:p>
-    <w:p>
-      <w:pPr>
-        <w:rPr>
-          <w:rFonts w:ascii="Times New Roman" w:hAnsi="Times New Roman" w:cs="Times New Roman"/>
-          <w:sz w:val="28"/>
-          <w:lang w:val="en-US"/>
-        </w:rPr>
-      </w:pPr>
-      <w:r>
-        <w:rPr>
-          <w:rFonts w:ascii="Times New Roman" w:hAnsi="Times New Roman" w:cs="Times New Roman"/>
-          <w:sz w:val="28"/>
-          <w:lang w:val="en-US"/>
-        </w:rPr>
-        <w:t>At the same time, the literature identifies significant limitations related to technical and programming complexity. Multiple studies report that educators often struggle to design effective Minecraft-based lessons due to limited programming knowledge and lack of confidence with the platform’s technical features (Bower et al., 2017; Nebel et al., 2020). A recent systematic review emphasizes that insufficient teacher training and high technical barriers frequently result in Minecraft being used in a superficial manner, which reduces its potential to support deeper learning outcomes (Shamsudin et al., 2024). These findings indicate that Minecraft’s educational benefits are strongly dependent on pedagogical structure and accessible tooling.</w:t>
-      </w:r>
-    </w:p>
-    <w:p>
-      <w:pPr>
-        <w:rPr>
-          <w:rFonts w:ascii="Times New Roman" w:hAnsi="Times New Roman" w:cs="Times New Roman"/>
-          <w:sz w:val="28"/>
-          <w:lang w:val="en-US"/>
-        </w:rPr>
-      </w:pPr>
-      <w:r>
-        <w:rPr>
-          <w:rFonts w:ascii="Times New Roman" w:hAnsi="Times New Roman" w:cs="Times New Roman"/>
-          <w:sz w:val="28"/>
-          <w:lang w:val="en-US"/>
-        </w:rPr>
-        <w:t>The implications of these findings are directly relevant to the development of a domain-specific language for children’s education. The reviewed research demonstrates that Minecraft provides a motivating and conceptually appropriate environment for introducing computational thinking, yet its effectiveness is constrained by technical complexity and the programming expertise required from both teachers and learners. A simplified domain-specific language can address these constraints by reducing syntactic and cognitive load while preserving immediate visual feedback and alignment with programming concepts. Such an approach is consistent with research recommendations calling for structured, accessible tools that enable learners to focus on logic and problem solving rather than technical implementation details (Microsoft, 2021; Shamsudin et al., 2024).</w:t>
+        <w:t xml:space="preserve">Research on the educational effectiveness of Minecraft consistently reports increased student engagement, motivation, and participation when the platform is integrated into structured learning activities. Studies grounded in constructivist and social constructivist learning theories highlight that Minecraft supports inquiry-based learning, problem solving, collaboration, and spatial reasoning (Short, 2012; </w:t>
+      </w:r>
+      <w:proofErr w:type="spellStart"/>
+      <w:r>
+        <w:rPr>
+          <w:rFonts w:ascii="Times New Roman" w:hAnsi="Times New Roman" w:cs="Times New Roman"/>
+          <w:sz w:val="28"/>
+          <w:lang w:val="en-US"/>
+        </w:rPr>
+        <w:t>Kotsopoulos</w:t>
+      </w:r>
+      <w:proofErr w:type="spellEnd"/>
+      <w:r>
+        <w:rPr>
+          <w:rFonts w:ascii="Times New Roman" w:hAnsi="Times New Roman" w:cs="Times New Roman"/>
+          <w:sz w:val="28"/>
+          <w:lang w:val="en-US"/>
+        </w:rPr>
+        <w:t xml:space="preserve"> et al., 2017). Experimental research further indicates that Minecraft-based interventions can lead to measurable improvements in spatial and cognitive skills, provided that instructional goals are explicit and teacher guidance is present (Zhang et al., 2021).</w:t>
+      </w:r>
+    </w:p>
+    <w:p>
+      <w:pPr>
+        <w:rPr>
+          <w:rFonts w:ascii="Times New Roman" w:hAnsi="Times New Roman" w:cs="Times New Roman"/>
+          <w:sz w:val="28"/>
+          <w:lang w:val="en-US"/>
+        </w:rPr>
+      </w:pPr>
+      <w:r>
+        <w:rPr>
+          <w:rFonts w:ascii="Times New Roman" w:hAnsi="Times New Roman" w:cs="Times New Roman"/>
+          <w:sz w:val="28"/>
+          <w:lang w:val="en-US"/>
+        </w:rPr>
+        <w:t xml:space="preserve">At the same time, the literature identifies significant limitations related to technical and programming complexity. Multiple studies report that educators often struggle to design effective Minecraft-based lessons due to limited programming knowledge and lack of confidence with the platform’s technical features (Bower et al., 2017; </w:t>
+      </w:r>
+      <w:proofErr w:type="spellStart"/>
+      <w:r>
+        <w:rPr>
+          <w:rFonts w:ascii="Times New Roman" w:hAnsi="Times New Roman" w:cs="Times New Roman"/>
+          <w:sz w:val="28"/>
+          <w:lang w:val="en-US"/>
+        </w:rPr>
+        <w:t>Nebel</w:t>
+      </w:r>
+      <w:proofErr w:type="spellEnd"/>
+      <w:r>
+        <w:rPr>
+          <w:rFonts w:ascii="Times New Roman" w:hAnsi="Times New Roman" w:cs="Times New Roman"/>
+          <w:sz w:val="28"/>
+          <w:lang w:val="en-US"/>
+        </w:rPr>
+        <w:t xml:space="preserve"> et al., 2020). A recent systematic review emphasizes that insufficient teacher training and high technical barriers frequently result in Minecraft being used in a superficial manner, which reduces its potential to support deeper learning outcomes (</w:t>
+      </w:r>
+      <w:proofErr w:type="spellStart"/>
+      <w:r>
+        <w:rPr>
+          <w:rFonts w:ascii="Times New Roman" w:hAnsi="Times New Roman" w:cs="Times New Roman"/>
+          <w:sz w:val="28"/>
+          <w:lang w:val="en-US"/>
+        </w:rPr>
+        <w:t>Shamsudin</w:t>
+      </w:r>
+      <w:proofErr w:type="spellEnd"/>
+      <w:r>
+        <w:rPr>
+          <w:rFonts w:ascii="Times New Roman" w:hAnsi="Times New Roman" w:cs="Times New Roman"/>
+          <w:sz w:val="28"/>
+          <w:lang w:val="en-US"/>
+        </w:rPr>
+        <w:t xml:space="preserve"> et al., 2024). These findings indicate that Minecraft’s educational benefits are strongly dependent on pedagogical structure and accessible tooling.</w:t>
+      </w:r>
+    </w:p>
+    <w:p>
+      <w:pPr>
+        <w:rPr>
+          <w:rFonts w:ascii="Times New Roman" w:hAnsi="Times New Roman" w:cs="Times New Roman"/>
+          <w:sz w:val="28"/>
+          <w:lang w:val="en-US"/>
+        </w:rPr>
+      </w:pPr>
+      <w:r>
+        <w:rPr>
+          <w:rFonts w:ascii="Times New Roman" w:hAnsi="Times New Roman" w:cs="Times New Roman"/>
+          <w:sz w:val="28"/>
+          <w:lang w:val="en-US"/>
+        </w:rPr>
+        <w:t>The implications of these findings are directly relevant to the development of a domain-specific language for children’s education. The reviewed research demonstrates that Minecraft provides a motivating and conceptually appropriate environment for introducing computational thinking, yet its effectiveness is constrained by technical complexity and the programming expertise required from both teachers and learners. A simplified domain-specific language can address these constraints by reducing syntactic and cognitive load while preserving immediate visual feedback and alignment with programming concepts. Such an approach is consistent with research recommendations calling for structured, accessible tools that enable learners to focus on logic and problem solving rather than technical implementation details (</w:t>
+      </w:r>
+      <w:proofErr w:type="spellStart"/>
+      <w:r>
+        <w:rPr>
+          <w:rFonts w:ascii="Times New Roman" w:hAnsi="Times New Roman" w:cs="Times New Roman"/>
+          <w:sz w:val="28"/>
+          <w:lang w:val="en-US"/>
+        </w:rPr>
+        <w:t>Shamsudin</w:t>
+      </w:r>
+      <w:proofErr w:type="spellEnd"/>
+      <w:r>
+        <w:rPr>
+          <w:rFonts w:ascii="Times New Roman" w:hAnsi="Times New Roman" w:cs="Times New Roman"/>
+          <w:sz w:val="28"/>
+          <w:lang w:val="en-US"/>
+        </w:rPr>
+        <w:t xml:space="preserve"> et al., 2024).</w:t>
       </w:r>
     </w:p>
     <w:p>
@@ -3581,51 +4988,117 @@
           <w:sz w:val="28"/>
           <w:lang w:val="en-US"/>
         </w:rPr>
-        <w:t>Bower, M., Wood, L. N., Lai, J. W., Howe, C., Lister, R., Mason, R., Highfield, K., Veal, J. (2017). Improving the computational thinking pedagogical capabilities of school teachers. Australian Journal of Teacher Education, 42(3).</w:t>
-      </w:r>
-    </w:p>
-    <w:p>
-      <w:pPr>
-        <w:rPr>
-          <w:rFonts w:ascii="Times New Roman" w:hAnsi="Times New Roman" w:cs="Times New Roman"/>
-          <w:sz w:val="28"/>
-          <w:lang w:val="en-US"/>
-        </w:rPr>
-      </w:pPr>
-      <w:r>
-        <w:rPr>
-          <w:rFonts w:ascii="Times New Roman" w:hAnsi="Times New Roman" w:cs="Times New Roman"/>
-          <w:sz w:val="28"/>
-          <w:lang w:val="en-US"/>
-        </w:rPr>
-        <w:t>Kotsopoulos, D., Floyd, L., Khan, S., Namukasa, I. K., Somanath, S., Weber, J., Yiu, C. (2017). A pedagogical framework for computational thinking. Digital Experiences in Mathematics Education, 3, 154–171.</w:t>
-      </w:r>
-    </w:p>
-    <w:p>
-      <w:pPr>
-        <w:rPr>
-          <w:rFonts w:ascii="Times New Roman" w:hAnsi="Times New Roman" w:cs="Times New Roman"/>
-          <w:sz w:val="28"/>
-          <w:lang w:val="en-US"/>
-        </w:rPr>
-      </w:pPr>
-      <w:r>
-        <w:rPr>
-          <w:rFonts w:ascii="Times New Roman" w:hAnsi="Times New Roman" w:cs="Times New Roman"/>
-          <w:sz w:val="28"/>
-          <w:lang w:val="en-US"/>
-        </w:rPr>
-        <w:t>Microsoft. (2021). Computer Science Curriculum Toolkit Whitepaper. Microsoft Education.</w:t>
-      </w:r>
-    </w:p>
-    <w:p>
-      <w:pPr>
-        <w:rPr>
-          <w:rFonts w:ascii="Times New Roman" w:hAnsi="Times New Roman" w:cs="Times New Roman"/>
-          <w:sz w:val="28"/>
-          <w:lang w:val="en-US"/>
-        </w:rPr>
-      </w:pPr>
+        <w:t xml:space="preserve">Bower, M., Wood, L. N., Lai, J. W., Howe, C., Lister, R., Mason, R., </w:t>
+      </w:r>
+      <w:proofErr w:type="spellStart"/>
+      <w:r>
+        <w:rPr>
+          <w:rFonts w:ascii="Times New Roman" w:hAnsi="Times New Roman" w:cs="Times New Roman"/>
+          <w:sz w:val="28"/>
+          <w:lang w:val="en-US"/>
+        </w:rPr>
+        <w:t>Highfield</w:t>
+      </w:r>
+      <w:proofErr w:type="spellEnd"/>
+      <w:r>
+        <w:rPr>
+          <w:rFonts w:ascii="Times New Roman" w:hAnsi="Times New Roman" w:cs="Times New Roman"/>
+          <w:sz w:val="28"/>
+          <w:lang w:val="en-US"/>
+        </w:rPr>
+        <w:t>, K., Veal, J. (2017). Improving the computational thinking pedagogical capabilities of school teachers. Australian Journal of Teacher Education, 42(3).</w:t>
+      </w:r>
+    </w:p>
+    <w:p>
+      <w:pPr>
+        <w:rPr>
+          <w:rFonts w:ascii="Times New Roman" w:hAnsi="Times New Roman" w:cs="Times New Roman"/>
+          <w:sz w:val="28"/>
+          <w:lang w:val="en-US"/>
+        </w:rPr>
+      </w:pPr>
+      <w:proofErr w:type="spellStart"/>
+      <w:r>
+        <w:rPr>
+          <w:rFonts w:ascii="Times New Roman" w:hAnsi="Times New Roman" w:cs="Times New Roman"/>
+          <w:sz w:val="28"/>
+          <w:lang w:val="en-US"/>
+        </w:rPr>
+        <w:t>Kotsopoulos</w:t>
+      </w:r>
+      <w:proofErr w:type="spellEnd"/>
+      <w:r>
+        <w:rPr>
+          <w:rFonts w:ascii="Times New Roman" w:hAnsi="Times New Roman" w:cs="Times New Roman"/>
+          <w:sz w:val="28"/>
+          <w:lang w:val="en-US"/>
+        </w:rPr>
+        <w:t xml:space="preserve">, D., Floyd, L., Khan, S., </w:t>
+      </w:r>
+      <w:proofErr w:type="spellStart"/>
+      <w:r>
+        <w:rPr>
+          <w:rFonts w:ascii="Times New Roman" w:hAnsi="Times New Roman" w:cs="Times New Roman"/>
+          <w:sz w:val="28"/>
+          <w:lang w:val="en-US"/>
+        </w:rPr>
+        <w:t>Namukasa</w:t>
+      </w:r>
+      <w:proofErr w:type="spellEnd"/>
+      <w:r>
+        <w:rPr>
+          <w:rFonts w:ascii="Times New Roman" w:hAnsi="Times New Roman" w:cs="Times New Roman"/>
+          <w:sz w:val="28"/>
+          <w:lang w:val="en-US"/>
+        </w:rPr>
+        <w:t xml:space="preserve">, I. K., </w:t>
+      </w:r>
+      <w:proofErr w:type="spellStart"/>
+      <w:r>
+        <w:rPr>
+          <w:rFonts w:ascii="Times New Roman" w:hAnsi="Times New Roman" w:cs="Times New Roman"/>
+          <w:sz w:val="28"/>
+          <w:lang w:val="en-US"/>
+        </w:rPr>
+        <w:t>Somanath</w:t>
+      </w:r>
+      <w:proofErr w:type="spellEnd"/>
+      <w:r>
+        <w:rPr>
+          <w:rFonts w:ascii="Times New Roman" w:hAnsi="Times New Roman" w:cs="Times New Roman"/>
+          <w:sz w:val="28"/>
+          <w:lang w:val="en-US"/>
+        </w:rPr>
+        <w:t xml:space="preserve">, S., Weber, J., </w:t>
+      </w:r>
+      <w:proofErr w:type="spellStart"/>
+      <w:r>
+        <w:rPr>
+          <w:rFonts w:ascii="Times New Roman" w:hAnsi="Times New Roman" w:cs="Times New Roman"/>
+          <w:sz w:val="28"/>
+          <w:lang w:val="en-US"/>
+        </w:rPr>
+        <w:t>Yiu</w:t>
+      </w:r>
+      <w:proofErr w:type="spellEnd"/>
+      <w:r>
+        <w:rPr>
+          <w:rFonts w:ascii="Times New Roman" w:hAnsi="Times New Roman" w:cs="Times New Roman"/>
+          <w:sz w:val="28"/>
+          <w:lang w:val="en-US"/>
+        </w:rPr>
+        <w:t>, C. (2017). A pedagogical framework for computational thinking. Digital Experiences in Mathematics Education, 3, 154–171.</w:t>
+      </w:r>
+    </w:p>
+    <w:p>
+      <w:pPr>
+        <w:rPr>
+          <w:rFonts w:ascii="Times New Roman" w:hAnsi="Times New Roman" w:cs="Times New Roman"/>
+          <w:sz w:val="28"/>
+          <w:lang w:val="en-US"/>
+        </w:rPr>
+      </w:pPr>
+      <w:proofErr w:type="spellStart"/>
       <w:r>
         <w:rPr>
           <w:rFonts w:ascii="Times New Roman" w:hAnsi="Times New Roman" w:cs="Times New Roman"/>
@@ -3633,24 +5106,79 @@
           <w:lang w:val="en-US"/>
         </w:rPr>
         <w:lastRenderedPageBreak/>
-        <w:t>Nebel, S., Schneider, S., Rey, G. D. (2020). The potential of Minecraft for STEM education: A systematic review of research from 2010 to 2020. Educational Technology and Society, 23(2), 37–49.</w:t>
-      </w:r>
-    </w:p>
-    <w:p>
-      <w:pPr>
-        <w:rPr>
-          <w:rFonts w:ascii="Times New Roman" w:hAnsi="Times New Roman" w:cs="Times New Roman"/>
-          <w:sz w:val="28"/>
-          <w:lang w:val="en-US"/>
-        </w:rPr>
-      </w:pPr>
-      <w:r>
-        <w:rPr>
-          <w:rFonts w:ascii="Times New Roman" w:hAnsi="Times New Roman" w:cs="Times New Roman"/>
-          <w:sz w:val="28"/>
-          <w:lang w:val="en-US"/>
-        </w:rPr>
-        <w:t>Shamsudin, N. M., Dalim, S. F., Atan, N. A. (2024). Crafting STEM lessons: A systematic literature review on the use of Minecraft in education (2015–2024). International Journal of Academic Research in Business and Social Sciences, 14(10).</w:t>
+        <w:t>Nebel</w:t>
+      </w:r>
+      <w:proofErr w:type="spellEnd"/>
+      <w:r>
+        <w:rPr>
+          <w:rFonts w:ascii="Times New Roman" w:hAnsi="Times New Roman" w:cs="Times New Roman"/>
+          <w:sz w:val="28"/>
+          <w:lang w:val="en-US"/>
+        </w:rPr>
+        <w:t>, S., Schneider, S., Rey, G. D. (2020). The potential of Minecraft for STEM education: A systematic review of research from 2010 to 2020. Educational Technology and Society, 23(2), 37–49.</w:t>
+      </w:r>
+    </w:p>
+    <w:p>
+      <w:pPr>
+        <w:rPr>
+          <w:rFonts w:ascii="Times New Roman" w:hAnsi="Times New Roman" w:cs="Times New Roman"/>
+          <w:sz w:val="28"/>
+          <w:lang w:val="en-US"/>
+        </w:rPr>
+      </w:pPr>
+      <w:proofErr w:type="spellStart"/>
+      <w:r>
+        <w:rPr>
+          <w:rFonts w:ascii="Times New Roman" w:hAnsi="Times New Roman" w:cs="Times New Roman"/>
+          <w:sz w:val="28"/>
+          <w:lang w:val="en-US"/>
+        </w:rPr>
+        <w:t>Shamsudin</w:t>
+      </w:r>
+      <w:proofErr w:type="spellEnd"/>
+      <w:r>
+        <w:rPr>
+          <w:rFonts w:ascii="Times New Roman" w:hAnsi="Times New Roman" w:cs="Times New Roman"/>
+          <w:sz w:val="28"/>
+          <w:lang w:val="en-US"/>
+        </w:rPr>
+        <w:t xml:space="preserve">, N. M., </w:t>
+      </w:r>
+      <w:proofErr w:type="spellStart"/>
+      <w:r>
+        <w:rPr>
+          <w:rFonts w:ascii="Times New Roman" w:hAnsi="Times New Roman" w:cs="Times New Roman"/>
+          <w:sz w:val="28"/>
+          <w:lang w:val="en-US"/>
+        </w:rPr>
+        <w:t>Dalim</w:t>
+      </w:r>
+      <w:proofErr w:type="spellEnd"/>
+      <w:r>
+        <w:rPr>
+          <w:rFonts w:ascii="Times New Roman" w:hAnsi="Times New Roman" w:cs="Times New Roman"/>
+          <w:sz w:val="28"/>
+          <w:lang w:val="en-US"/>
+        </w:rPr>
+        <w:t xml:space="preserve">, S. F., </w:t>
+      </w:r>
+      <w:proofErr w:type="spellStart"/>
+      <w:r>
+        <w:rPr>
+          <w:rFonts w:ascii="Times New Roman" w:hAnsi="Times New Roman" w:cs="Times New Roman"/>
+          <w:sz w:val="28"/>
+          <w:lang w:val="en-US"/>
+        </w:rPr>
+        <w:t>Atan</w:t>
+      </w:r>
+      <w:proofErr w:type="spellEnd"/>
+      <w:r>
+        <w:rPr>
+          <w:rFonts w:ascii="Times New Roman" w:hAnsi="Times New Roman" w:cs="Times New Roman"/>
+          <w:sz w:val="28"/>
+          <w:lang w:val="en-US"/>
+        </w:rPr>
+        <w:t>, N. A. (2024). Crafting STEM lessons: A systematic literature review on the use of Minecraft in education (2015–2024). International Journal of Academic Research in Business and Social Sciences, 14(10).</w:t>
       </w:r>
     </w:p>
     <w:p>
@@ -3678,13 +5206,41 @@
           <w:lang w:val="en-US"/>
         </w:rPr>
       </w:pPr>
-      <w:r>
-        <w:rPr>
-          <w:rFonts w:ascii="Times New Roman" w:hAnsi="Times New Roman" w:cs="Times New Roman"/>
-          <w:sz w:val="28"/>
-          <w:lang w:val="en-US"/>
-        </w:rPr>
-        <w:t>Tablatin, C. L. S., Casano, J. D., Rodrigo, M. M. T. (2023). Using Minecraft to cultivate student interest in STEM. Frontiers in Education, 8, 1127984.</w:t>
+      <w:proofErr w:type="spellStart"/>
+      <w:r>
+        <w:rPr>
+          <w:rFonts w:ascii="Times New Roman" w:hAnsi="Times New Roman" w:cs="Times New Roman"/>
+          <w:sz w:val="28"/>
+          <w:lang w:val="en-US"/>
+        </w:rPr>
+        <w:t>Tablatin</w:t>
+      </w:r>
+      <w:proofErr w:type="spellEnd"/>
+      <w:r>
+        <w:rPr>
+          <w:rFonts w:ascii="Times New Roman" w:hAnsi="Times New Roman" w:cs="Times New Roman"/>
+          <w:sz w:val="28"/>
+          <w:lang w:val="en-US"/>
+        </w:rPr>
+        <w:t xml:space="preserve">, C. L. S., </w:t>
+      </w:r>
+      <w:proofErr w:type="spellStart"/>
+      <w:r>
+        <w:rPr>
+          <w:rFonts w:ascii="Times New Roman" w:hAnsi="Times New Roman" w:cs="Times New Roman"/>
+          <w:sz w:val="28"/>
+          <w:lang w:val="en-US"/>
+        </w:rPr>
+        <w:t>Casano</w:t>
+      </w:r>
+      <w:proofErr w:type="spellEnd"/>
+      <w:r>
+        <w:rPr>
+          <w:rFonts w:ascii="Times New Roman" w:hAnsi="Times New Roman" w:cs="Times New Roman"/>
+          <w:sz w:val="28"/>
+          <w:lang w:val="en-US"/>
+        </w:rPr>
+        <w:t>, J. D., Rodrigo, M. M. T. (2023). Using Minecraft to cultivate student interest in STEM. Frontiers in Education, 8, 1127984.</w:t>
       </w:r>
     </w:p>
     <w:p>
@@ -3744,8 +5300,21 @@
           <w:lang w:val="en-US"/>
         </w:rPr>
         <w:lastRenderedPageBreak/>
-        <w:t>Task 4: Problem Definition and Use Cases</w:t>
-      </w:r>
+        <w:t xml:space="preserve">Task 4: </w:t>
+      </w:r>
+      <w:bookmarkStart w:id="0" w:name="_GoBack"/>
+      <w:r>
+        <w:rPr>
+          <w:b/>
+          <w:bCs/>
+          <w:color w:val="000000"/>
+          <w:sz w:val="28"/>
+          <w:szCs w:val="26"/>
+          <w:lang w:val="en-US"/>
+        </w:rPr>
+        <w:t>Problem Definition and Use Cases</w:t>
+      </w:r>
+      <w:bookmarkEnd w:id="0"/>
     </w:p>
     <w:p>
       <w:pPr>
@@ -3868,7 +5437,47 @@
           <w:szCs w:val="28"/>
           <w:lang w:val="en-US"/>
         </w:rPr>
-        <w:t>Children face Java requirements far above beginner level when working with Minecraft mods. Tools like ComputerCraft use Lua syntax that confuses young learners. Setup complexity takes time before anyone writes a single line of code, which stops</w:t>
+        <w:t xml:space="preserve">Children face Java requirements far above beginner level when working with Minecraft mods. Tools like </w:t>
+      </w:r>
+      <w:proofErr w:type="spellStart"/>
+      <w:r>
+        <w:rPr>
+          <w:color w:val="000000"/>
+          <w:sz w:val="28"/>
+          <w:szCs w:val="28"/>
+          <w:lang w:val="en-US"/>
+        </w:rPr>
+        <w:t>ComputerCraft</w:t>
+      </w:r>
+      <w:proofErr w:type="spellEnd"/>
+      <w:r>
+        <w:rPr>
+          <w:color w:val="000000"/>
+          <w:sz w:val="28"/>
+          <w:szCs w:val="28"/>
+          <w:lang w:val="en-US"/>
+        </w:rPr>
+        <w:t xml:space="preserve"> use </w:t>
+      </w:r>
+      <w:proofErr w:type="spellStart"/>
+      <w:r>
+        <w:rPr>
+          <w:color w:val="000000"/>
+          <w:sz w:val="28"/>
+          <w:szCs w:val="28"/>
+          <w:lang w:val="en-US"/>
+        </w:rPr>
+        <w:t>Lua</w:t>
+      </w:r>
+      <w:proofErr w:type="spellEnd"/>
+      <w:r>
+        <w:rPr>
+          <w:color w:val="000000"/>
+          <w:sz w:val="28"/>
+          <w:szCs w:val="28"/>
+          <w:lang w:val="en-US"/>
+        </w:rPr>
+        <w:t xml:space="preserve"> syntax that confuses young learners. Setup complexity takes time before anyone writes a single line of code, which stops</w:t>
       </w:r>
       <w:r>
         <w:rPr>
@@ -4758,6 +6367,7 @@
           <w:lang w:val="en-US"/>
         </w:rPr>
       </w:pPr>
+      <w:proofErr w:type="spellStart"/>
       <w:r>
         <w:rPr>
           <w:b/>
@@ -4769,6 +6379,7 @@
         </w:rPr>
         <w:t>ComputerCraft</w:t>
       </w:r>
+      <w:proofErr w:type="spellEnd"/>
       <w:r>
         <w:rPr>
           <w:b/>
@@ -4780,14 +6391,45 @@
         </w:rPr>
         <w:br/>
       </w:r>
-      <w:r>
-        <w:rPr>
-          <w:color w:val="000000"/>
-          <w:sz w:val="28"/>
-          <w:szCs w:val="28"/>
-          <w:lang w:val="en-US"/>
-        </w:rPr>
-        <w:t>ComputerCraft introduces real programming concepts through Lua, but it requires text-based coding from the start. Installation and setup demand technical knowledge often unavailable to parents. Documentation assumes prior programming experience, which can overwhelm beginners. Young learners face high complexity before achieving results, leading to frustration and early disengagement [8].</w:t>
+      <w:proofErr w:type="spellStart"/>
+      <w:r>
+        <w:rPr>
+          <w:color w:val="000000"/>
+          <w:sz w:val="28"/>
+          <w:szCs w:val="28"/>
+          <w:lang w:val="en-US"/>
+        </w:rPr>
+        <w:t>ComputerCraft</w:t>
+      </w:r>
+      <w:proofErr w:type="spellEnd"/>
+      <w:r>
+        <w:rPr>
+          <w:color w:val="000000"/>
+          <w:sz w:val="28"/>
+          <w:szCs w:val="28"/>
+          <w:lang w:val="en-US"/>
+        </w:rPr>
+        <w:t xml:space="preserve"> introduces real programming concepts through </w:t>
+      </w:r>
+      <w:proofErr w:type="spellStart"/>
+      <w:r>
+        <w:rPr>
+          <w:color w:val="000000"/>
+          <w:sz w:val="28"/>
+          <w:szCs w:val="28"/>
+          <w:lang w:val="en-US"/>
+        </w:rPr>
+        <w:t>Lua</w:t>
+      </w:r>
+      <w:proofErr w:type="spellEnd"/>
+      <w:r>
+        <w:rPr>
+          <w:color w:val="000000"/>
+          <w:sz w:val="28"/>
+          <w:szCs w:val="28"/>
+          <w:lang w:val="en-US"/>
+        </w:rPr>
+        <w:t>, but it requires text-based coding from the start. Installation and setup demand technical knowledge often unavailable to parents. Documentation assumes prior programming experience, which can overwhelm beginners. Young learners face high complexity before achieving results, leading to frustration and early disengagement [8].</w:t>
       </w:r>
     </w:p>
     <w:p>
@@ -4886,7 +6528,27 @@
           <w:szCs w:val="28"/>
           <w:lang w:val="en-US"/>
         </w:rPr>
-        <w:t>[1] “Disadvantages of Connecting Blocks to Create Scripts in Scratch Programming Language,” PiEmbSysTech, accessed Feb. 2026.</w:t>
+        <w:t xml:space="preserve">[1] “Disadvantages of Connecting Blocks to Create Scripts in Scratch Programming Language,” </w:t>
+      </w:r>
+      <w:proofErr w:type="spellStart"/>
+      <w:r>
+        <w:rPr>
+          <w:color w:val="000000"/>
+          <w:sz w:val="28"/>
+          <w:szCs w:val="28"/>
+          <w:lang w:val="en-US"/>
+        </w:rPr>
+        <w:t>PiEmbSysTech</w:t>
+      </w:r>
+      <w:proofErr w:type="spellEnd"/>
+      <w:r>
+        <w:rPr>
+          <w:color w:val="000000"/>
+          <w:sz w:val="28"/>
+          <w:szCs w:val="28"/>
+          <w:lang w:val="en-US"/>
+        </w:rPr>
+        <w:t>, accessed Feb. 2026.</w:t>
       </w:r>
       <w:r>
         <w:rPr>
@@ -4906,7 +6568,27 @@
           <w:lang w:val="en-US"/>
         </w:rPr>
         <w:noBreakHyphen/>
-        <w:t>depth Comparison,” LearnCodingUSA, accessed Feb. 2026.</w:t>
+        <w:t xml:space="preserve">depth Comparison,” </w:t>
+      </w:r>
+      <w:proofErr w:type="spellStart"/>
+      <w:r>
+        <w:rPr>
+          <w:color w:val="000000"/>
+          <w:sz w:val="28"/>
+          <w:szCs w:val="28"/>
+          <w:lang w:val="en-US"/>
+        </w:rPr>
+        <w:t>LearnCodingUSA</w:t>
+      </w:r>
+      <w:proofErr w:type="spellEnd"/>
+      <w:r>
+        <w:rPr>
+          <w:color w:val="000000"/>
+          <w:sz w:val="28"/>
+          <w:szCs w:val="28"/>
+          <w:lang w:val="en-US"/>
+        </w:rPr>
+        <w:t>, accessed Feb. 2026.</w:t>
       </w:r>
       <w:r>
         <w:rPr>
@@ -4926,7 +6608,27 @@
           <w:lang w:val="en-US"/>
         </w:rPr>
         <w:noBreakHyphen/>
-        <w:t>based Refactoring,” arXiv, Aug. 2021.</w:t>
+        <w:t xml:space="preserve">based Refactoring,” </w:t>
+      </w:r>
+      <w:proofErr w:type="spellStart"/>
+      <w:r>
+        <w:rPr>
+          <w:color w:val="000000"/>
+          <w:sz w:val="28"/>
+          <w:szCs w:val="28"/>
+          <w:lang w:val="en-US"/>
+        </w:rPr>
+        <w:t>arXiv</w:t>
+      </w:r>
+      <w:proofErr w:type="spellEnd"/>
+      <w:r>
+        <w:rPr>
+          <w:color w:val="000000"/>
+          <w:sz w:val="28"/>
+          <w:szCs w:val="28"/>
+          <w:lang w:val="en-US"/>
+        </w:rPr>
+        <w:t>, Aug. 2021.</w:t>
       </w:r>
       <w:r>
         <w:rPr>
@@ -4956,7 +6658,16 @@
           <w:lang w:val="en-US"/>
         </w:rPr>
         <w:br/>
-        <w:t>[7] “Journal of Education and Learning; Vol. 14, No. 4; 2025,” ERIC, accessed Feb. 2026.</w:t>
+        <w:t xml:space="preserve">[7] </w:t>
+      </w:r>
+      <w:r>
+        <w:rPr>
+          <w:color w:val="000000"/>
+          <w:sz w:val="28"/>
+          <w:szCs w:val="28"/>
+          <w:lang w:val="en-US"/>
+        </w:rPr>
+        <w:t>Gamified Learning: Teaching Coding and Creative Thinking with Minecraft: Education Edition (M:EE) for Thai Students</w:t>
       </w:r>
     </w:p>
     <w:p>
@@ -4976,7 +6687,47 @@
           <w:szCs w:val="28"/>
           <w:lang w:val="en-US"/>
         </w:rPr>
-        <w:t>[8] M. Kazemitabaar et al., “Scaffolding Progress: How Structured Editors Shape Novice Errors When Transitioning from Blocks to Text,” arXiv, Feb. 2023.</w:t>
+        <w:t xml:space="preserve">[8] M. </w:t>
+      </w:r>
+      <w:proofErr w:type="spellStart"/>
+      <w:r>
+        <w:rPr>
+          <w:color w:val="000000"/>
+          <w:sz w:val="28"/>
+          <w:szCs w:val="28"/>
+          <w:lang w:val="en-US"/>
+        </w:rPr>
+        <w:t>Kazemitabaar</w:t>
+      </w:r>
+      <w:proofErr w:type="spellEnd"/>
+      <w:r>
+        <w:rPr>
+          <w:color w:val="000000"/>
+          <w:sz w:val="28"/>
+          <w:szCs w:val="28"/>
+          <w:lang w:val="en-US"/>
+        </w:rPr>
+        <w:t xml:space="preserve"> et al., “Scaffolding Progress: How Structured Editors Shape Novice Errors When Transitioning from Blocks to Text,” </w:t>
+      </w:r>
+      <w:proofErr w:type="spellStart"/>
+      <w:r>
+        <w:rPr>
+          <w:color w:val="000000"/>
+          <w:sz w:val="28"/>
+          <w:szCs w:val="28"/>
+          <w:lang w:val="en-US"/>
+        </w:rPr>
+        <w:t>arXiv</w:t>
+      </w:r>
+      <w:proofErr w:type="spellEnd"/>
+      <w:r>
+        <w:rPr>
+          <w:color w:val="000000"/>
+          <w:sz w:val="28"/>
+          <w:szCs w:val="28"/>
+          <w:lang w:val="en-US"/>
+        </w:rPr>
+        <w:t>, Feb. 2023.</w:t>
       </w:r>
     </w:p>
     <w:p>
@@ -5043,7 +6794,31 @@
           <w:szCs w:val="28"/>
           <w:lang w:val="en-US"/>
         </w:rPr>
-        <w:t>DSL for Modding Minecraft</w:t>
+        <w:t xml:space="preserve">DSL for </w:t>
+      </w:r>
+      <w:proofErr w:type="spellStart"/>
+      <w:r>
+        <w:rPr>
+          <w:b/>
+          <w:bCs/>
+          <w:color w:val="000000"/>
+          <w:sz w:val="28"/>
+          <w:szCs w:val="28"/>
+          <w:lang w:val="en-US"/>
+        </w:rPr>
+        <w:t>Modding</w:t>
+      </w:r>
+      <w:proofErr w:type="spellEnd"/>
+      <w:r>
+        <w:rPr>
+          <w:b/>
+          <w:bCs/>
+          <w:color w:val="000000"/>
+          <w:sz w:val="28"/>
+          <w:szCs w:val="28"/>
+          <w:lang w:val="en-US"/>
+        </w:rPr>
+        <w:t xml:space="preserve"> Minecraft</w:t>
       </w:r>
       <w:r>
         <w:rPr>
@@ -5065,16 +6840,29 @@
           <w:lang w:val="en-US"/>
         </w:rPr>
       </w:pPr>
-      <w:r>
-        <w:rPr>
-          <w:b/>
-          <w:bCs/>
-          <w:color w:val="000000"/>
-          <w:sz w:val="28"/>
-          <w:szCs w:val="28"/>
-          <w:lang w:val="en-US"/>
-        </w:rPr>
-        <w:t xml:space="preserve">Minescript </w:t>
+      <w:proofErr w:type="spellStart"/>
+      <w:r>
+        <w:rPr>
+          <w:b/>
+          <w:bCs/>
+          <w:color w:val="000000"/>
+          <w:sz w:val="28"/>
+          <w:szCs w:val="28"/>
+          <w:lang w:val="en-US"/>
+        </w:rPr>
+        <w:t>Minescript</w:t>
+      </w:r>
+      <w:proofErr w:type="spellEnd"/>
+      <w:r>
+        <w:rPr>
+          <w:b/>
+          <w:bCs/>
+          <w:color w:val="000000"/>
+          <w:sz w:val="28"/>
+          <w:szCs w:val="28"/>
+          <w:lang w:val="en-US"/>
+        </w:rPr>
+        <w:t xml:space="preserve"> </w:t>
       </w:r>
       <w:r>
         <w:rPr>
@@ -5107,6 +6895,7 @@
           <w:lang w:val="en-US"/>
         </w:rPr>
       </w:pPr>
+      <w:proofErr w:type="spellStart"/>
       <w:r>
         <w:rPr>
           <w:b/>
@@ -5118,15 +6907,27 @@
         </w:rPr>
         <w:t>SpigotDSL</w:t>
       </w:r>
-      <w:r>
-        <w:rPr>
-          <w:color w:val="000000"/>
-          <w:sz w:val="28"/>
-          <w:szCs w:val="28"/>
-          <w:lang w:val="en-US"/>
-        </w:rPr>
-        <w:t xml:space="preserve"> is a Kotlin</w:t>
-      </w:r>
+      <w:proofErr w:type="spellEnd"/>
+      <w:r>
+        <w:rPr>
+          <w:color w:val="000000"/>
+          <w:sz w:val="28"/>
+          <w:szCs w:val="28"/>
+          <w:lang w:val="en-US"/>
+        </w:rPr>
+        <w:t xml:space="preserve"> is a </w:t>
+      </w:r>
+      <w:proofErr w:type="spellStart"/>
+      <w:r>
+        <w:rPr>
+          <w:color w:val="000000"/>
+          <w:sz w:val="28"/>
+          <w:szCs w:val="28"/>
+          <w:lang w:val="en-US"/>
+        </w:rPr>
+        <w:t>Kotlin</w:t>
+      </w:r>
+      <w:proofErr w:type="spellEnd"/>
       <w:r>
         <w:rPr>
           <w:color w:val="000000"/>
@@ -5145,7 +6946,27 @@
           <w:lang w:val="en-US"/>
         </w:rPr>
         <w:noBreakHyphen/>
-        <w:t>specific library that makes writing server plugins more readable. It leverages Kotlin’s DSL features to express plugin logic (such as event handlers) in a concise way compared to raw Java. It is a DSL in the sense of domain</w:t>
+        <w:t xml:space="preserve">specific library that makes writing server plugins more readable. It leverages </w:t>
+      </w:r>
+      <w:proofErr w:type="spellStart"/>
+      <w:r>
+        <w:rPr>
+          <w:color w:val="000000"/>
+          <w:sz w:val="28"/>
+          <w:szCs w:val="28"/>
+          <w:lang w:val="en-US"/>
+        </w:rPr>
+        <w:t>Kotlin’s</w:t>
+      </w:r>
+      <w:proofErr w:type="spellEnd"/>
+      <w:r>
+        <w:rPr>
+          <w:color w:val="000000"/>
+          <w:sz w:val="28"/>
+          <w:szCs w:val="28"/>
+          <w:lang w:val="en-US"/>
+        </w:rPr>
+        <w:t xml:space="preserve"> DSL features to express plugin logic (such as event handlers) in a concise way compared to raw Java. It is a DSL in the sense of domain</w:t>
       </w:r>
       <w:r>
         <w:rPr>
@@ -5221,7 +7042,47 @@
           <w:szCs w:val="28"/>
           <w:lang w:val="en-US"/>
         </w:rPr>
-        <w:t>[1] A. Stalla, “DSL for Modding Minecraft,” tomassetti.me, accessed Feb. 2026.</w:t>
+        <w:t xml:space="preserve">[1] A. </w:t>
+      </w:r>
+      <w:proofErr w:type="spellStart"/>
+      <w:r>
+        <w:rPr>
+          <w:color w:val="000000"/>
+          <w:sz w:val="28"/>
+          <w:szCs w:val="28"/>
+          <w:lang w:val="en-US"/>
+        </w:rPr>
+        <w:t>Stalla</w:t>
+      </w:r>
+      <w:proofErr w:type="spellEnd"/>
+      <w:r>
+        <w:rPr>
+          <w:color w:val="000000"/>
+          <w:sz w:val="28"/>
+          <w:szCs w:val="28"/>
+          <w:lang w:val="en-US"/>
+        </w:rPr>
+        <w:t xml:space="preserve">, “DSL for </w:t>
+      </w:r>
+      <w:proofErr w:type="spellStart"/>
+      <w:r>
+        <w:rPr>
+          <w:color w:val="000000"/>
+          <w:sz w:val="28"/>
+          <w:szCs w:val="28"/>
+          <w:lang w:val="en-US"/>
+        </w:rPr>
+        <w:t>Modding</w:t>
+      </w:r>
+      <w:proofErr w:type="spellEnd"/>
+      <w:r>
+        <w:rPr>
+          <w:color w:val="000000"/>
+          <w:sz w:val="28"/>
+          <w:szCs w:val="28"/>
+          <w:lang w:val="en-US"/>
+        </w:rPr>
+        <w:t xml:space="preserve"> Minecraft,” tomassetti.me, accessed Feb. 2026.</w:t>
       </w:r>
     </w:p>
     <w:p>
@@ -5242,7 +7103,27 @@
           <w:lang w:val="en-US"/>
         </w:rPr>
         <w:lastRenderedPageBreak/>
-        <w:t>[2] Minescript project page, minescript.net, accessed Feb. 2026.</w:t>
+        <w:t xml:space="preserve">[2] </w:t>
+      </w:r>
+      <w:proofErr w:type="spellStart"/>
+      <w:r>
+        <w:rPr>
+          <w:color w:val="000000"/>
+          <w:sz w:val="28"/>
+          <w:szCs w:val="28"/>
+          <w:lang w:val="en-US"/>
+        </w:rPr>
+        <w:t>Minescript</w:t>
+      </w:r>
+      <w:proofErr w:type="spellEnd"/>
+      <w:r>
+        <w:rPr>
+          <w:color w:val="000000"/>
+          <w:sz w:val="28"/>
+          <w:szCs w:val="28"/>
+          <w:lang w:val="en-US"/>
+        </w:rPr>
+        <w:t xml:space="preserve"> project page, minescript.net, accessed Feb. 2026.</w:t>
       </w:r>
     </w:p>
     <w:p>
@@ -5262,7 +7143,27 @@
           <w:szCs w:val="28"/>
           <w:lang w:val="en-US"/>
         </w:rPr>
-        <w:t>[3] “SpigotDSL” https://www.spigotmc.org/resources/spigotdsl.79383/, accessed Feb. 2026.</w:t>
+        <w:t>[3] “</w:t>
+      </w:r>
+      <w:proofErr w:type="spellStart"/>
+      <w:r>
+        <w:rPr>
+          <w:color w:val="000000"/>
+          <w:sz w:val="28"/>
+          <w:szCs w:val="28"/>
+          <w:lang w:val="en-US"/>
+        </w:rPr>
+        <w:t>SpigotDSL</w:t>
+      </w:r>
+      <w:proofErr w:type="spellEnd"/>
+      <w:r>
+        <w:rPr>
+          <w:color w:val="000000"/>
+          <w:sz w:val="28"/>
+          <w:szCs w:val="28"/>
+          <w:lang w:val="en-US"/>
+        </w:rPr>
+        <w:t>” https://www.spigotmc.org/resources/spigotdsl.79383/, accessed Feb. 2026.</w:t>
       </w:r>
     </w:p>
     <w:p>
@@ -5918,7 +7819,27 @@
             <w:szCs w:val="28"/>
             <w:lang w:val="en-US"/>
           </w:rPr>
-          <w:t>https://www.researchgate.net/publication/399391402_Programming_Paradigm_Learning_Curves_An_Empirical_Study_of_Developer_Skill_Acquisition_in_Functional_Object-Oriented_and_Imperative_Programming</w:t>
+          <w:t>https://www.researchgate.net/publication/399391402_Programming_Paradigm_Learning_Curves_An_Empirical_</w:t>
+        </w:r>
+        <w:r>
+          <w:rPr>
+            <w:rStyle w:val="a4"/>
+            <w:rFonts w:ascii="Times New Roman" w:hAnsi="Times New Roman" w:cs="Times New Roman"/>
+            <w:sz w:val="28"/>
+            <w:szCs w:val="28"/>
+            <w:lang w:val="en-US"/>
+          </w:rPr>
+          <w:t>S</w:t>
+        </w:r>
+        <w:r>
+          <w:rPr>
+            <w:rStyle w:val="a4"/>
+            <w:rFonts w:ascii="Times New Roman" w:hAnsi="Times New Roman" w:cs="Times New Roman"/>
+            <w:sz w:val="28"/>
+            <w:szCs w:val="28"/>
+            <w:lang w:val="en-US"/>
+          </w:rPr>
+          <w:t>tudy_of_Developer_Skill_Acquisition_in_Functional_Object-Oriented_and_Imperative_Programming</w:t>
         </w:r>
       </w:hyperlink>
     </w:p>
@@ -7468,7 +9389,6 @@
   <w:style w:type="character" w:default="1" w:styleId="a0">
     <w:name w:val="Default Paragraph Font"/>
     <w:uiPriority w:val="1"/>
-    <w:semiHidden/>
     <w:unhideWhenUsed/>
   </w:style>
   <w:style w:type="table" w:default="1" w:styleId="a1">

</xml_diff>